<commit_message>
feat(sidang): implement new templates for seminar invitations and evaluation forms, enhance document generation logic
</commit_message>
<xml_diff>
--- a/template/SIDANG/BA sidang akhir.docx
+++ b/template/SIDANG/BA sidang akhir.docx
@@ -9,6 +9,7 @@
         <w:jc w:val="center"/>
         <w:rPr>
           <w:b/>
+          <w:color w:val="000000" w:themeColor="text1"/>
           <w:sz w:val="26"/>
           <w:szCs w:val="26"/>
         </w:rPr>
@@ -16,6 +17,7 @@
       <w:r>
         <w:rPr>
           <w:b/>
+          <w:color w:val="000000" w:themeColor="text1"/>
           <w:sz w:val="26"/>
           <w:szCs w:val="26"/>
         </w:rPr>
@@ -24,6 +26,7 @@
       <w:r>
         <w:rPr>
           <w:b/>
+          <w:color w:val="000000" w:themeColor="text1"/>
           <w:spacing w:val="-4"/>
           <w:sz w:val="26"/>
           <w:szCs w:val="26"/>
@@ -33,6 +36,7 @@
       <w:r>
         <w:rPr>
           <w:b/>
+          <w:color w:val="000000" w:themeColor="text1"/>
           <w:spacing w:val="-2"/>
           <w:sz w:val="26"/>
           <w:szCs w:val="26"/>
@@ -42,6 +46,7 @@
       <w:r>
         <w:rPr>
           <w:b/>
+          <w:color w:val="000000" w:themeColor="text1"/>
           <w:spacing w:val="-2"/>
           <w:sz w:val="26"/>
           <w:szCs w:val="26"/>
@@ -51,6 +56,7 @@
       <w:r>
         <w:rPr>
           <w:b/>
+          <w:color w:val="000000" w:themeColor="text1"/>
           <w:spacing w:val="-2"/>
           <w:sz w:val="26"/>
           <w:szCs w:val="26"/>
@@ -60,6 +66,7 @@
       <w:r>
         <w:rPr>
           <w:b/>
+          <w:color w:val="000000" w:themeColor="text1"/>
           <w:spacing w:val="-2"/>
           <w:sz w:val="26"/>
           <w:szCs w:val="26"/>
@@ -74,6 +81,7 @@
         <w:jc w:val="center"/>
         <w:rPr>
           <w:b/>
+          <w:color w:val="000000" w:themeColor="text1"/>
           <w:sz w:val="26"/>
           <w:szCs w:val="26"/>
         </w:rPr>
@@ -81,6 +89,7 @@
       <w:r>
         <w:rPr>
           <w:b/>
+          <w:color w:val="000000" w:themeColor="text1"/>
           <w:sz w:val="26"/>
           <w:szCs w:val="26"/>
         </w:rPr>
@@ -89,6 +98,7 @@
       <w:r>
         <w:rPr>
           <w:b/>
+          <w:color w:val="000000" w:themeColor="text1"/>
           <w:spacing w:val="-7"/>
           <w:sz w:val="26"/>
           <w:szCs w:val="26"/>
@@ -98,6 +108,7 @@
       <w:r>
         <w:rPr>
           <w:b/>
+          <w:color w:val="000000" w:themeColor="text1"/>
           <w:sz w:val="26"/>
           <w:szCs w:val="26"/>
         </w:rPr>
@@ -106,6 +117,7 @@
       <w:r>
         <w:rPr>
           <w:b/>
+          <w:color w:val="000000" w:themeColor="text1"/>
           <w:spacing w:val="-7"/>
           <w:sz w:val="26"/>
           <w:szCs w:val="26"/>
@@ -115,6 +127,7 @@
       <w:r>
         <w:rPr>
           <w:b/>
+          <w:color w:val="000000" w:themeColor="text1"/>
           <w:sz w:val="26"/>
           <w:szCs w:val="26"/>
         </w:rPr>
@@ -133,6 +146,7 @@
           <w:rFonts w:ascii="Times New Roman" w:hAnsi="Times New Roman" w:cs="Times New Roman"/>
           <w:b/>
           <w:bCs/>
+          <w:color w:val="000000" w:themeColor="text1"/>
         </w:rPr>
       </w:pPr>
     </w:p>
@@ -145,17 +159,20 @@
         <w:ind w:left="0"/>
         <w:rPr>
           <w:rFonts w:ascii="Times New Roman" w:hAnsi="Times New Roman" w:cs="Times New Roman"/>
-        </w:rPr>
-      </w:pPr>
-      <w:r>
-        <w:rPr>
-          <w:rFonts w:ascii="Times New Roman" w:hAnsi="Times New Roman" w:cs="Times New Roman"/>
+          <w:color w:val="000000" w:themeColor="text1"/>
+        </w:rPr>
+      </w:pPr>
+      <w:r>
+        <w:rPr>
+          <w:rFonts w:ascii="Times New Roman" w:hAnsi="Times New Roman" w:cs="Times New Roman"/>
+          <w:color w:val="000000" w:themeColor="text1"/>
         </w:rPr>
         <w:t>Nama</w:t>
       </w:r>
       <w:r>
         <w:rPr>
           <w:rFonts w:ascii="Times New Roman" w:hAnsi="Times New Roman" w:cs="Times New Roman"/>
+          <w:color w:val="000000" w:themeColor="text1"/>
           <w:spacing w:val="-5"/>
         </w:rPr>
         <w:t xml:space="preserve"> </w:t>
@@ -163,6 +180,7 @@
       <w:r>
         <w:rPr>
           <w:rFonts w:ascii="Times New Roman" w:hAnsi="Times New Roman" w:cs="Times New Roman"/>
+          <w:color w:val="000000" w:themeColor="text1"/>
           <w:spacing w:val="-2"/>
         </w:rPr>
         <w:t>Mahasiswa</w:t>
@@ -170,12 +188,14 @@
       <w:r>
         <w:rPr>
           <w:rFonts w:ascii="Times New Roman" w:hAnsi="Times New Roman" w:cs="Times New Roman"/>
+          <w:color w:val="000000" w:themeColor="text1"/>
         </w:rPr>
         <w:tab/>
       </w:r>
       <w:r>
         <w:rPr>
           <w:rFonts w:ascii="Times New Roman" w:hAnsi="Times New Roman" w:cs="Times New Roman"/>
+          <w:color w:val="000000" w:themeColor="text1"/>
           <w:spacing w:val="-10"/>
         </w:rPr>
         <w:t>:</w:t>
@@ -183,6 +203,7 @@
       <w:r>
         <w:rPr>
           <w:rFonts w:ascii="Times New Roman" w:hAnsi="Times New Roman" w:cs="Times New Roman"/>
+          <w:color w:val="000000" w:themeColor="text1"/>
           <w:spacing w:val="-10"/>
         </w:rPr>
         <w:t xml:space="preserve"> </w:t>
@@ -190,6 +211,7 @@
       <w:r>
         <w:rPr>
           <w:rFonts w:ascii="Times New Roman" w:hAnsi="Times New Roman" w:cs="Times New Roman"/>
+          <w:color w:val="000000" w:themeColor="text1"/>
           <w:spacing w:val="-10"/>
         </w:rPr>
         <w:t>$</w:t>
@@ -199,28 +221,10 @@
           <w:rFonts w:ascii="Times New Roman" w:hAnsi="Times New Roman" w:cs="Times New Roman"/>
           <w:b/>
           <w:bCs/>
+          <w:color w:val="000000" w:themeColor="text1"/>
           <w:spacing w:val="-10"/>
         </w:rPr>
-        <w:t>(</w:t>
-      </w:r>
-      <w:r>
-        <w:rPr>
-          <w:rFonts w:ascii="Times New Roman" w:hAnsi="Times New Roman" w:cs="Times New Roman"/>
-          <w:b/>
-          <w:bCs/>
-          <w:color w:val="FF0000"/>
-          <w:spacing w:val="-10"/>
-        </w:rPr>
-        <w:t>nama mhs</w:t>
-      </w:r>
-      <w:r>
-        <w:rPr>
-          <w:rFonts w:ascii="Times New Roman" w:hAnsi="Times New Roman" w:cs="Times New Roman"/>
-          <w:b/>
-          <w:bCs/>
-          <w:spacing w:val="-10"/>
-        </w:rPr>
-        <w:t>)</w:t>
+        <w:t>(nama mhs)</w:t>
       </w:r>
     </w:p>
     <w:p>
@@ -232,17 +236,20 @@
         <w:ind w:left="0"/>
         <w:rPr>
           <w:rFonts w:ascii="Times New Roman" w:hAnsi="Times New Roman" w:cs="Times New Roman"/>
-        </w:rPr>
-      </w:pPr>
-      <w:r>
-        <w:rPr>
-          <w:rFonts w:ascii="Times New Roman" w:hAnsi="Times New Roman" w:cs="Times New Roman"/>
+          <w:color w:val="000000" w:themeColor="text1"/>
+        </w:rPr>
+      </w:pPr>
+      <w:r>
+        <w:rPr>
+          <w:rFonts w:ascii="Times New Roman" w:hAnsi="Times New Roman" w:cs="Times New Roman"/>
+          <w:color w:val="000000" w:themeColor="text1"/>
         </w:rPr>
         <w:t>N I</w:t>
       </w:r>
       <w:r>
         <w:rPr>
           <w:rFonts w:ascii="Times New Roman" w:hAnsi="Times New Roman" w:cs="Times New Roman"/>
+          <w:color w:val="000000" w:themeColor="text1"/>
           <w:spacing w:val="-5"/>
         </w:rPr>
         <w:t xml:space="preserve"> </w:t>
@@ -250,6 +257,7 @@
       <w:r>
         <w:rPr>
           <w:rFonts w:ascii="Times New Roman" w:hAnsi="Times New Roman" w:cs="Times New Roman"/>
+          <w:color w:val="000000" w:themeColor="text1"/>
           <w:spacing w:val="-10"/>
         </w:rPr>
         <w:t>M</w:t>
@@ -257,12 +265,14 @@
       <w:r>
         <w:rPr>
           <w:rFonts w:ascii="Times New Roman" w:hAnsi="Times New Roman" w:cs="Times New Roman"/>
+          <w:color w:val="000000" w:themeColor="text1"/>
         </w:rPr>
         <w:tab/>
       </w:r>
       <w:r>
         <w:rPr>
           <w:rFonts w:ascii="Times New Roman" w:hAnsi="Times New Roman" w:cs="Times New Roman"/>
+          <w:color w:val="000000" w:themeColor="text1"/>
           <w:spacing w:val="-10"/>
         </w:rPr>
         <w:t>:</w:t>
@@ -270,6 +280,7 @@
       <w:r>
         <w:rPr>
           <w:rFonts w:ascii="Times New Roman" w:hAnsi="Times New Roman" w:cs="Times New Roman"/>
+          <w:color w:val="000000" w:themeColor="text1"/>
           <w:spacing w:val="-10"/>
         </w:rPr>
         <w:t xml:space="preserve"> </w:t>
@@ -277,6 +288,7 @@
       <w:r>
         <w:rPr>
           <w:rFonts w:ascii="Times New Roman" w:hAnsi="Times New Roman" w:cs="Times New Roman"/>
+          <w:color w:val="000000" w:themeColor="text1"/>
           <w:spacing w:val="-10"/>
         </w:rPr>
         <w:t>$</w:t>
@@ -284,24 +296,10 @@
       <w:r>
         <w:rPr>
           <w:rFonts w:ascii="Times New Roman" w:hAnsi="Times New Roman" w:cs="Times New Roman"/>
+          <w:color w:val="000000" w:themeColor="text1"/>
           <w:spacing w:val="-10"/>
         </w:rPr>
-        <w:t>(</w:t>
-      </w:r>
-      <w:r>
-        <w:rPr>
-          <w:rFonts w:ascii="Times New Roman" w:hAnsi="Times New Roman" w:cs="Times New Roman"/>
-          <w:color w:val="FF0000"/>
-          <w:spacing w:val="-10"/>
-        </w:rPr>
-        <w:t>nim</w:t>
-      </w:r>
-      <w:r>
-        <w:rPr>
-          <w:rFonts w:ascii="Times New Roman" w:hAnsi="Times New Roman" w:cs="Times New Roman"/>
-          <w:spacing w:val="-10"/>
-        </w:rPr>
-        <w:t>)</w:t>
+        <w:t>(nim)</w:t>
       </w:r>
     </w:p>
     <w:p>
@@ -313,17 +311,20 @@
         <w:ind w:left="0"/>
         <w:rPr>
           <w:rFonts w:ascii="Times New Roman" w:hAnsi="Times New Roman" w:cs="Times New Roman"/>
-        </w:rPr>
-      </w:pPr>
-      <w:r>
-        <w:rPr>
-          <w:rFonts w:ascii="Times New Roman" w:hAnsi="Times New Roman" w:cs="Times New Roman"/>
+          <w:color w:val="000000" w:themeColor="text1"/>
+        </w:rPr>
+      </w:pPr>
+      <w:r>
+        <w:rPr>
+          <w:rFonts w:ascii="Times New Roman" w:hAnsi="Times New Roman" w:cs="Times New Roman"/>
+          <w:color w:val="000000" w:themeColor="text1"/>
         </w:rPr>
         <w:t>Judul</w:t>
       </w:r>
       <w:r>
         <w:rPr>
           <w:rFonts w:ascii="Times New Roman" w:hAnsi="Times New Roman" w:cs="Times New Roman"/>
+          <w:color w:val="000000" w:themeColor="text1"/>
           <w:spacing w:val="-6"/>
         </w:rPr>
         <w:t xml:space="preserve"> </w:t>
@@ -331,6 +332,7 @@
       <w:r>
         <w:rPr>
           <w:rFonts w:ascii="Times New Roman" w:hAnsi="Times New Roman" w:cs="Times New Roman"/>
+          <w:color w:val="000000" w:themeColor="text1"/>
           <w:spacing w:val="-2"/>
         </w:rPr>
         <w:t>Penelitian</w:t>
@@ -338,12 +340,14 @@
       <w:r>
         <w:rPr>
           <w:rFonts w:ascii="Times New Roman" w:hAnsi="Times New Roman" w:cs="Times New Roman"/>
+          <w:color w:val="000000" w:themeColor="text1"/>
         </w:rPr>
         <w:tab/>
       </w:r>
       <w:r>
         <w:rPr>
           <w:rFonts w:ascii="Times New Roman" w:hAnsi="Times New Roman" w:cs="Times New Roman"/>
+          <w:color w:val="000000" w:themeColor="text1"/>
           <w:spacing w:val="-10"/>
         </w:rPr>
         <w:t>:</w:t>
@@ -351,6 +355,7 @@
       <w:r>
         <w:rPr>
           <w:rFonts w:ascii="Times New Roman" w:hAnsi="Times New Roman" w:cs="Times New Roman"/>
+          <w:color w:val="000000" w:themeColor="text1"/>
           <w:spacing w:val="-10"/>
         </w:rPr>
         <w:t xml:space="preserve"> </w:t>
@@ -358,6 +363,7 @@
       <w:r>
         <w:rPr>
           <w:rFonts w:ascii="Times New Roman" w:hAnsi="Times New Roman" w:cs="Times New Roman"/>
+          <w:color w:val="000000" w:themeColor="text1"/>
           <w:spacing w:val="-10"/>
         </w:rPr>
         <w:t>$</w:t>
@@ -365,24 +371,10 @@
       <w:r>
         <w:rPr>
           <w:rFonts w:ascii="Times New Roman" w:hAnsi="Times New Roman" w:cs="Times New Roman"/>
+          <w:color w:val="000000" w:themeColor="text1"/>
           <w:spacing w:val="-10"/>
         </w:rPr>
-        <w:t>(</w:t>
-      </w:r>
-      <w:r>
-        <w:rPr>
-          <w:rFonts w:ascii="Times New Roman" w:hAnsi="Times New Roman" w:cs="Times New Roman"/>
-          <w:color w:val="FF0000"/>
-          <w:spacing w:val="-10"/>
-        </w:rPr>
-        <w:t>judul</w:t>
-      </w:r>
-      <w:r>
-        <w:rPr>
-          <w:rFonts w:ascii="Times New Roman" w:hAnsi="Times New Roman" w:cs="Times New Roman"/>
-          <w:spacing w:val="-10"/>
-        </w:rPr>
-        <w:t>)</w:t>
+        <w:t>(judul)</w:t>
       </w:r>
     </w:p>
     <w:tbl>
@@ -415,17 +407,20 @@
               <w:pStyle w:val="TableParagraph"/>
               <w:ind w:left="50"/>
               <w:rPr>
-                <w:sz w:val="24"/>
-              </w:rPr>
-            </w:pPr>
-            <w:r>
-              <w:rPr>
+                <w:color w:val="000000" w:themeColor="text1"/>
+                <w:sz w:val="24"/>
+              </w:rPr>
+            </w:pPr>
+            <w:r>
+              <w:rPr>
+                <w:color w:val="000000" w:themeColor="text1"/>
                 <w:sz w:val="24"/>
               </w:rPr>
               <w:t>Hari/Tanggal</w:t>
             </w:r>
             <w:r>
               <w:rPr>
+                <w:color w:val="000000" w:themeColor="text1"/>
                 <w:spacing w:val="-7"/>
                 <w:sz w:val="24"/>
               </w:rPr>
@@ -433,6 +428,7 @@
             </w:r>
             <w:r>
               <w:rPr>
+                <w:color w:val="000000" w:themeColor="text1"/>
                 <w:spacing w:val="-2"/>
                 <w:sz w:val="24"/>
               </w:rPr>
@@ -449,43 +445,32 @@
               <w:pStyle w:val="TableParagraph"/>
               <w:ind w:left="-67"/>
               <w:rPr>
+                <w:color w:val="000000" w:themeColor="text1"/>
                 <w:sz w:val="24"/>
                 <w:lang w:val="en-US"/>
               </w:rPr>
             </w:pPr>
             <w:r>
               <w:rPr>
+                <w:color w:val="000000" w:themeColor="text1"/>
                 <w:sz w:val="24"/>
               </w:rPr>
               <w:t xml:space="preserve">:: </w:t>
             </w:r>
             <w:r>
               <w:rPr>
+                <w:color w:val="000000" w:themeColor="text1"/>
                 <w:sz w:val="24"/>
               </w:rPr>
               <w:t>$</w:t>
             </w:r>
             <w:r>
               <w:rPr>
+                <w:color w:val="000000" w:themeColor="text1"/>
                 <w:sz w:val="24"/>
                 <w:lang w:val="en-US"/>
               </w:rPr>
-              <w:t>(</w:t>
-            </w:r>
-            <w:r>
-              <w:rPr>
-                <w:color w:val="FF0000"/>
-                <w:sz w:val="24"/>
-                <w:lang w:val="en-US"/>
-              </w:rPr>
-              <w:t>tgl sidang</w:t>
-            </w:r>
-            <w:r>
-              <w:rPr>
-                <w:sz w:val="24"/>
-                <w:lang w:val="en-US"/>
-              </w:rPr>
-              <w:t>)</w:t>
+              <w:t>(tgl sidang)</w:t>
             </w:r>
           </w:p>
         </w:tc>
@@ -499,11 +484,13 @@
               <w:ind w:right="167"/>
               <w:jc w:val="right"/>
               <w:rPr>
-                <w:sz w:val="24"/>
-              </w:rPr>
-            </w:pPr>
-            <w:r>
-              <w:rPr>
+                <w:color w:val="000000" w:themeColor="text1"/>
+                <w:sz w:val="24"/>
+              </w:rPr>
+            </w:pPr>
+            <w:r>
+              <w:rPr>
+                <w:color w:val="000000" w:themeColor="text1"/>
                 <w:spacing w:val="-5"/>
                 <w:sz w:val="24"/>
               </w:rPr>
@@ -520,23 +507,27 @@
               <w:pStyle w:val="TableParagraph"/>
               <w:ind w:left="165"/>
               <w:rPr>
-                <w:sz w:val="24"/>
-              </w:rPr>
-            </w:pPr>
-            <w:r>
-              <w:rPr>
+                <w:color w:val="000000" w:themeColor="text1"/>
+                <w:sz w:val="24"/>
+              </w:rPr>
+            </w:pPr>
+            <w:r>
+              <w:rPr>
+                <w:color w:val="000000" w:themeColor="text1"/>
                 <w:sz w:val="24"/>
               </w:rPr>
               <w:t xml:space="preserve">: </w:t>
             </w:r>
             <w:r>
               <w:rPr>
+                <w:color w:val="000000" w:themeColor="text1"/>
                 <w:sz w:val="24"/>
               </w:rPr>
               <w:t>$</w:t>
             </w:r>
             <w:r>
               <w:rPr>
+                <w:color w:val="000000" w:themeColor="text1"/>
                 <w:sz w:val="24"/>
                 <w:lang w:val="en-US"/>
               </w:rPr>
@@ -544,30 +535,24 @@
             </w:r>
             <w:r>
               <w:rPr>
-                <w:color w:val="FF0000"/>
+                <w:color w:val="000000" w:themeColor="text1"/>
                 <w:spacing w:val="-4"/>
                 <w:sz w:val="24"/>
                 <w:lang w:val="en-US"/>
               </w:rPr>
-              <w:t>waktu</w:t>
-            </w:r>
-            <w:r>
-              <w:rPr>
+              <w:t>waktu)</w:t>
+            </w:r>
+            <w:r>
+              <w:rPr>
+                <w:color w:val="000000" w:themeColor="text1"/>
                 <w:spacing w:val="-4"/>
                 <w:sz w:val="24"/>
-                <w:lang w:val="en-US"/>
-              </w:rPr>
-              <w:t>)</w:t>
-            </w:r>
-            <w:r>
-              <w:rPr>
-                <w:spacing w:val="-4"/>
-                <w:sz w:val="24"/>
               </w:rPr>
               <w:t xml:space="preserve"> sd </w:t>
             </w:r>
             <w:r>
               <w:rPr>
+                <w:color w:val="000000" w:themeColor="text1"/>
                 <w:spacing w:val="-4"/>
                 <w:sz w:val="24"/>
               </w:rPr>
@@ -584,6 +569,9 @@
           <w:tab w:val="left" w:pos="2250"/>
         </w:tabs>
         <w:ind w:left="0"/>
+        <w:rPr>
+          <w:color w:val="000000" w:themeColor="text1"/>
+        </w:rPr>
       </w:pPr>
     </w:p>
     <w:p>
@@ -598,6 +586,7 @@
           <w:rFonts w:ascii="Times New Roman" w:hAnsi="Times New Roman" w:cs="Times New Roman"/>
           <w:b/>
           <w:bCs/>
+          <w:color w:val="000000" w:themeColor="text1"/>
           <w:u w:val="single"/>
         </w:rPr>
       </w:pPr>
@@ -606,6 +595,7 @@
           <w:rFonts w:ascii="Times New Roman" w:hAnsi="Times New Roman" w:cs="Times New Roman"/>
           <w:b/>
           <w:bCs/>
+          <w:color w:val="000000" w:themeColor="text1"/>
           <w:u w:val="single"/>
         </w:rPr>
         <w:t>Penilaian:</w:t>
@@ -652,11 +642,13 @@
               <w:jc w:val="center"/>
               <w:rPr>
                 <w:b/>
+                <w:color w:val="000000" w:themeColor="text1"/>
               </w:rPr>
             </w:pPr>
             <w:r>
               <w:rPr>
                 <w:b/>
+                <w:color w:val="000000" w:themeColor="text1"/>
                 <w:spacing w:val="-6"/>
               </w:rPr>
               <w:t xml:space="preserve">NO </w:t>
@@ -664,6 +656,7 @@
             <w:r>
               <w:rPr>
                 <w:b/>
+                <w:color w:val="000000" w:themeColor="text1"/>
                 <w:spacing w:val="-5"/>
               </w:rPr>
               <w:t>(1)</w:t>
@@ -682,17 +675,20 @@
               <w:jc w:val="center"/>
               <w:rPr>
                 <w:b/>
+                <w:color w:val="000000" w:themeColor="text1"/>
               </w:rPr>
             </w:pPr>
             <w:r>
               <w:rPr>
                 <w:b/>
+                <w:color w:val="000000" w:themeColor="text1"/>
               </w:rPr>
               <w:t>Komponen</w:t>
             </w:r>
             <w:r>
               <w:rPr>
                 <w:b/>
+                <w:color w:val="000000" w:themeColor="text1"/>
                 <w:spacing w:val="-14"/>
               </w:rPr>
               <w:t xml:space="preserve"> </w:t>
@@ -700,6 +696,7 @@
             <w:r>
               <w:rPr>
                 <w:b/>
+                <w:color w:val="000000" w:themeColor="text1"/>
               </w:rPr>
               <w:t>Penilaian</w:t>
             </w:r>
@@ -712,11 +709,13 @@
               <w:jc w:val="center"/>
               <w:rPr>
                 <w:b/>
+                <w:color w:val="000000" w:themeColor="text1"/>
               </w:rPr>
             </w:pPr>
             <w:r>
               <w:rPr>
                 <w:b/>
+                <w:color w:val="000000" w:themeColor="text1"/>
                 <w:spacing w:val="-4"/>
               </w:rPr>
               <w:t>(2)</w:t>
@@ -735,11 +734,13 @@
               <w:jc w:val="center"/>
               <w:rPr>
                 <w:b/>
+                <w:color w:val="000000" w:themeColor="text1"/>
               </w:rPr>
             </w:pPr>
             <w:r>
               <w:rPr>
                 <w:b/>
+                <w:color w:val="000000" w:themeColor="text1"/>
                 <w:spacing w:val="-2"/>
               </w:rPr>
               <w:t xml:space="preserve">Nilai </w:t>
@@ -747,6 +748,7 @@
             <w:r>
               <w:rPr>
                 <w:b/>
+                <w:color w:val="000000" w:themeColor="text1"/>
                 <w:spacing w:val="-4"/>
               </w:rPr>
               <w:t>(3)</w:t>
@@ -765,11 +767,13 @@
               <w:jc w:val="center"/>
               <w:rPr>
                 <w:b/>
+                <w:color w:val="000000" w:themeColor="text1"/>
               </w:rPr>
             </w:pPr>
             <w:r>
               <w:rPr>
                 <w:b/>
+                <w:color w:val="000000" w:themeColor="text1"/>
                 <w:spacing w:val="-2"/>
               </w:rPr>
               <w:t xml:space="preserve">Keterangan </w:t>
@@ -777,6 +781,7 @@
             <w:r>
               <w:rPr>
                 <w:b/>
+                <w:color w:val="000000" w:themeColor="text1"/>
                 <w:spacing w:val="-4"/>
               </w:rPr>
               <w:t>(4)</w:t>
@@ -798,8 +803,14 @@
               <w:spacing w:before="43"/>
               <w:ind w:left="7"/>
               <w:jc w:val="center"/>
-            </w:pPr>
-            <w:r>
+              <w:rPr>
+                <w:color w:val="000000" w:themeColor="text1"/>
+              </w:rPr>
+            </w:pPr>
+            <w:r>
+              <w:rPr>
+                <w:color w:val="000000" w:themeColor="text1"/>
+              </w:rPr>
               <w:t>1</w:t>
             </w:r>
           </w:p>
@@ -813,8 +824,14 @@
               <w:pStyle w:val="TableParagraph"/>
               <w:spacing w:before="43"/>
               <w:ind w:left="110"/>
-            </w:pPr>
-            <w:r>
+              <w:rPr>
+                <w:color w:val="000000" w:themeColor="text1"/>
+              </w:rPr>
+            </w:pPr>
+            <w:r>
+              <w:rPr>
+                <w:color w:val="000000" w:themeColor="text1"/>
+              </w:rPr>
               <w:t>Ketua Tim Pembimbing</w:t>
             </w:r>
           </w:p>
@@ -828,11 +845,13 @@
               <w:pStyle w:val="TableParagraph"/>
               <w:jc w:val="center"/>
               <w:rPr>
+                <w:color w:val="000000" w:themeColor="text1"/>
                 <w:lang w:val="en-US"/>
               </w:rPr>
             </w:pPr>
             <w:r>
               <w:rPr>
+                <w:color w:val="000000" w:themeColor="text1"/>
                 <w:lang w:val="en-US"/>
               </w:rPr>
               <w:t>Nilai rata2</w:t>
@@ -851,36 +870,35 @@
               <w:spacing w:before="41"/>
               <w:ind w:left="111"/>
               <w:jc w:val="center"/>
-            </w:pPr>
-            <w:r>
-              <w:t>D</w:t>
-            </w:r>
-            <w:r>
-              <w:t>iambil d</w:t>
-            </w:r>
-            <w:r>
-              <w:t>ari</w:t>
-            </w:r>
-            <w:r>
-              <w:rPr>
+              <w:rPr>
+                <w:color w:val="000000" w:themeColor="text1"/>
+              </w:rPr>
+            </w:pPr>
+            <w:r>
+              <w:rPr>
+                <w:color w:val="000000" w:themeColor="text1"/>
+              </w:rPr>
+              <w:t>Diambil dari</w:t>
+            </w:r>
+            <w:r>
+              <w:rPr>
+                <w:color w:val="000000" w:themeColor="text1"/>
                 <w:spacing w:val="-2"/>
               </w:rPr>
               <w:t xml:space="preserve"> </w:t>
             </w:r>
             <w:r>
+              <w:rPr>
+                <w:color w:val="000000" w:themeColor="text1"/>
+              </w:rPr>
               <w:t>Form</w:t>
             </w:r>
             <w:r>
               <w:rPr>
+                <w:color w:val="000000" w:themeColor="text1"/>
                 <w:spacing w:val="-2"/>
               </w:rPr>
-              <w:t xml:space="preserve"> #30</w:t>
-            </w:r>
-            <w:r>
-              <w:rPr>
-                <w:spacing w:val="-2"/>
-              </w:rPr>
-              <w:t>9.1</w:t>
+              <w:t xml:space="preserve"> #309.1</w:t>
             </w:r>
           </w:p>
         </w:tc>
@@ -899,8 +917,14 @@
               <w:spacing w:before="44"/>
               <w:ind w:left="7"/>
               <w:jc w:val="center"/>
-            </w:pPr>
-            <w:r>
+              <w:rPr>
+                <w:color w:val="000000" w:themeColor="text1"/>
+              </w:rPr>
+            </w:pPr>
+            <w:r>
+              <w:rPr>
+                <w:color w:val="000000" w:themeColor="text1"/>
+              </w:rPr>
               <w:t>2</w:t>
             </w:r>
           </w:p>
@@ -914,8 +938,14 @@
               <w:pStyle w:val="TableParagraph"/>
               <w:spacing w:before="44"/>
               <w:ind w:left="110"/>
-            </w:pPr>
-            <w:r>
+              <w:rPr>
+                <w:color w:val="000000" w:themeColor="text1"/>
+              </w:rPr>
+            </w:pPr>
+            <w:r>
+              <w:rPr>
+                <w:color w:val="000000" w:themeColor="text1"/>
+              </w:rPr>
               <w:t>Ko-Pembimbing 1</w:t>
             </w:r>
           </w:p>
@@ -928,9 +958,13 @@
             <w:pPr>
               <w:pStyle w:val="TableParagraph"/>
               <w:jc w:val="center"/>
-            </w:pPr>
-            <w:r>
-              <w:rPr>
+              <w:rPr>
+                <w:color w:val="000000" w:themeColor="text1"/>
+              </w:rPr>
+            </w:pPr>
+            <w:r>
+              <w:rPr>
+                <w:color w:val="000000" w:themeColor="text1"/>
                 <w:lang w:val="en-US"/>
               </w:rPr>
               <w:t>Nilai rata2</w:t>
@@ -947,6 +981,9 @@
               <w:pStyle w:val="TableParagraph"/>
               <w:spacing w:before="41"/>
               <w:ind w:left="111"/>
+              <w:rPr>
+                <w:color w:val="000000" w:themeColor="text1"/>
+              </w:rPr>
             </w:pPr>
           </w:p>
         </w:tc>
@@ -965,8 +1002,14 @@
               <w:spacing w:before="41"/>
               <w:ind w:left="7"/>
               <w:jc w:val="center"/>
-            </w:pPr>
-            <w:r>
+              <w:rPr>
+                <w:color w:val="000000" w:themeColor="text1"/>
+              </w:rPr>
+            </w:pPr>
+            <w:r>
+              <w:rPr>
+                <w:color w:val="000000" w:themeColor="text1"/>
+              </w:rPr>
               <w:t>3</w:t>
             </w:r>
           </w:p>
@@ -980,8 +1023,14 @@
               <w:pStyle w:val="TableParagraph"/>
               <w:spacing w:before="41"/>
               <w:ind w:left="110"/>
-            </w:pPr>
-            <w:r>
+              <w:rPr>
+                <w:color w:val="000000" w:themeColor="text1"/>
+              </w:rPr>
+            </w:pPr>
+            <w:r>
+              <w:rPr>
+                <w:color w:val="000000" w:themeColor="text1"/>
+              </w:rPr>
               <w:t>Ko-Pembimbing 2</w:t>
             </w:r>
           </w:p>
@@ -994,9 +1043,13 @@
             <w:pPr>
               <w:pStyle w:val="TableParagraph"/>
               <w:jc w:val="center"/>
-            </w:pPr>
-            <w:r>
-              <w:rPr>
+              <w:rPr>
+                <w:color w:val="000000" w:themeColor="text1"/>
+              </w:rPr>
+            </w:pPr>
+            <w:r>
+              <w:rPr>
+                <w:color w:val="000000" w:themeColor="text1"/>
                 <w:lang w:val="en-US"/>
               </w:rPr>
               <w:t>Nilai rata2</w:t>
@@ -1013,6 +1066,9 @@
               <w:pStyle w:val="TableParagraph"/>
               <w:spacing w:before="41"/>
               <w:ind w:left="111"/>
+              <w:rPr>
+                <w:color w:val="000000" w:themeColor="text1"/>
+              </w:rPr>
             </w:pPr>
           </w:p>
         </w:tc>
@@ -1031,8 +1087,14 @@
               <w:spacing w:before="41"/>
               <w:ind w:left="7"/>
               <w:jc w:val="center"/>
-            </w:pPr>
-            <w:r>
+              <w:rPr>
+                <w:color w:val="000000" w:themeColor="text1"/>
+              </w:rPr>
+            </w:pPr>
+            <w:r>
+              <w:rPr>
+                <w:color w:val="000000" w:themeColor="text1"/>
+              </w:rPr>
               <w:t>4</w:t>
             </w:r>
           </w:p>
@@ -1046,18 +1108,26 @@
               <w:pStyle w:val="TableParagraph"/>
               <w:spacing w:before="41"/>
               <w:ind w:left="110"/>
-            </w:pPr>
-            <w:r>
+              <w:rPr>
+                <w:color w:val="000000" w:themeColor="text1"/>
+              </w:rPr>
+            </w:pPr>
+            <w:r>
+              <w:rPr>
+                <w:color w:val="000000" w:themeColor="text1"/>
+              </w:rPr>
               <w:t>Penguji</w:t>
             </w:r>
             <w:r>
               <w:rPr>
+                <w:color w:val="000000" w:themeColor="text1"/>
                 <w:spacing w:val="-3"/>
               </w:rPr>
               <w:t xml:space="preserve"> </w:t>
             </w:r>
             <w:r>
               <w:rPr>
+                <w:color w:val="000000" w:themeColor="text1"/>
                 <w:spacing w:val="-10"/>
               </w:rPr>
               <w:t>1</w:t>
@@ -1072,9 +1142,13 @@
             <w:pPr>
               <w:pStyle w:val="TableParagraph"/>
               <w:jc w:val="center"/>
-            </w:pPr>
-            <w:r>
-              <w:rPr>
+              <w:rPr>
+                <w:color w:val="000000" w:themeColor="text1"/>
+              </w:rPr>
+            </w:pPr>
+            <w:r>
+              <w:rPr>
+                <w:color w:val="000000" w:themeColor="text1"/>
                 <w:lang w:val="en-US"/>
               </w:rPr>
               <w:t>Nilai rata2</w:t>
@@ -1091,6 +1165,9 @@
               <w:pStyle w:val="TableParagraph"/>
               <w:spacing w:before="41"/>
               <w:ind w:left="111"/>
+              <w:rPr>
+                <w:color w:val="000000" w:themeColor="text1"/>
+              </w:rPr>
             </w:pPr>
           </w:p>
         </w:tc>
@@ -1109,8 +1186,14 @@
               <w:spacing w:before="41"/>
               <w:ind w:left="7"/>
               <w:jc w:val="center"/>
-            </w:pPr>
-            <w:r>
+              <w:rPr>
+                <w:color w:val="000000" w:themeColor="text1"/>
+              </w:rPr>
+            </w:pPr>
+            <w:r>
+              <w:rPr>
+                <w:color w:val="000000" w:themeColor="text1"/>
+              </w:rPr>
               <w:t>5</w:t>
             </w:r>
           </w:p>
@@ -1124,18 +1207,26 @@
               <w:pStyle w:val="TableParagraph"/>
               <w:spacing w:before="41"/>
               <w:ind w:left="110"/>
-            </w:pPr>
-            <w:r>
+              <w:rPr>
+                <w:color w:val="000000" w:themeColor="text1"/>
+              </w:rPr>
+            </w:pPr>
+            <w:r>
+              <w:rPr>
+                <w:color w:val="000000" w:themeColor="text1"/>
+              </w:rPr>
               <w:t>Penguji</w:t>
             </w:r>
             <w:r>
               <w:rPr>
+                <w:color w:val="000000" w:themeColor="text1"/>
                 <w:spacing w:val="-3"/>
               </w:rPr>
               <w:t xml:space="preserve"> </w:t>
             </w:r>
             <w:r>
               <w:rPr>
+                <w:color w:val="000000" w:themeColor="text1"/>
                 <w:spacing w:val="-10"/>
               </w:rPr>
               <w:t>2</w:t>
@@ -1150,9 +1241,13 @@
             <w:pPr>
               <w:pStyle w:val="TableParagraph"/>
               <w:jc w:val="center"/>
-            </w:pPr>
-            <w:r>
-              <w:rPr>
+              <w:rPr>
+                <w:color w:val="000000" w:themeColor="text1"/>
+              </w:rPr>
+            </w:pPr>
+            <w:r>
+              <w:rPr>
+                <w:color w:val="000000" w:themeColor="text1"/>
                 <w:lang w:val="en-US"/>
               </w:rPr>
               <w:t>Nilai rata2</w:t>
@@ -1169,6 +1264,9 @@
               <w:pStyle w:val="TableParagraph"/>
               <w:spacing w:before="41"/>
               <w:ind w:left="111"/>
+              <w:rPr>
+                <w:color w:val="000000" w:themeColor="text1"/>
+              </w:rPr>
             </w:pPr>
           </w:p>
         </w:tc>
@@ -1187,8 +1285,14 @@
               <w:spacing w:before="41"/>
               <w:ind w:left="7"/>
               <w:jc w:val="center"/>
-            </w:pPr>
-            <w:r>
+              <w:rPr>
+                <w:color w:val="000000" w:themeColor="text1"/>
+              </w:rPr>
+            </w:pPr>
+            <w:r>
+              <w:rPr>
+                <w:color w:val="000000" w:themeColor="text1"/>
+              </w:rPr>
               <w:t>6</w:t>
             </w:r>
           </w:p>
@@ -1202,14 +1306,26 @@
               <w:pStyle w:val="TableParagraph"/>
               <w:spacing w:before="41"/>
               <w:ind w:left="110"/>
-            </w:pPr>
-            <w:r>
+              <w:rPr>
+                <w:color w:val="000000" w:themeColor="text1"/>
+              </w:rPr>
+            </w:pPr>
+            <w:r>
+              <w:rPr>
+                <w:color w:val="000000" w:themeColor="text1"/>
+              </w:rPr>
               <w:t>Pen</w:t>
             </w:r>
             <w:r>
+              <w:rPr>
+                <w:color w:val="000000" w:themeColor="text1"/>
+              </w:rPr>
               <w:t>guji</w:t>
             </w:r>
             <w:r>
+              <w:rPr>
+                <w:color w:val="000000" w:themeColor="text1"/>
+              </w:rPr>
               <w:t xml:space="preserve"> 3</w:t>
             </w:r>
           </w:p>
@@ -1222,9 +1338,13 @@
             <w:pPr>
               <w:pStyle w:val="TableParagraph"/>
               <w:jc w:val="center"/>
-            </w:pPr>
-            <w:r>
-              <w:rPr>
+              <w:rPr>
+                <w:color w:val="000000" w:themeColor="text1"/>
+              </w:rPr>
+            </w:pPr>
+            <w:r>
+              <w:rPr>
+                <w:color w:val="000000" w:themeColor="text1"/>
                 <w:lang w:val="en-US"/>
               </w:rPr>
               <w:t>Nilai rata2</w:t>
@@ -1241,6 +1361,9 @@
               <w:pStyle w:val="TableParagraph"/>
               <w:spacing w:before="41"/>
               <w:ind w:left="111"/>
+              <w:rPr>
+                <w:color w:val="000000" w:themeColor="text1"/>
+              </w:rPr>
             </w:pPr>
           </w:p>
         </w:tc>
@@ -1257,8 +1380,14 @@
             <w:pPr>
               <w:pStyle w:val="TableParagraph"/>
               <w:jc w:val="center"/>
-            </w:pPr>
-            <w:r>
+              <w:rPr>
+                <w:color w:val="000000" w:themeColor="text1"/>
+              </w:rPr>
+            </w:pPr>
+            <w:r>
+              <w:rPr>
+                <w:color w:val="000000" w:themeColor="text1"/>
+              </w:rPr>
               <w:t>7</w:t>
             </w:r>
           </w:p>
@@ -1271,21 +1400,32 @@
             <w:pPr>
               <w:pStyle w:val="TableParagraph"/>
               <w:ind w:left="110" w:right="22"/>
-            </w:pPr>
-            <w:r>
+              <w:rPr>
+                <w:color w:val="000000" w:themeColor="text1"/>
+              </w:rPr>
+            </w:pPr>
+            <w:r>
+              <w:rPr>
+                <w:color w:val="000000" w:themeColor="text1"/>
+              </w:rPr>
               <w:t>Nilai</w:t>
             </w:r>
             <w:r>
               <w:rPr>
+                <w:color w:val="000000" w:themeColor="text1"/>
                 <w:spacing w:val="-10"/>
               </w:rPr>
               <w:t xml:space="preserve"> </w:t>
             </w:r>
             <w:r>
+              <w:rPr>
+                <w:color w:val="000000" w:themeColor="text1"/>
+              </w:rPr>
               <w:t>Rata-</w:t>
             </w:r>
             <w:r>
               <w:rPr>
+                <w:color w:val="000000" w:themeColor="text1"/>
                 <w:spacing w:val="-4"/>
               </w:rPr>
               <w:t>Rata</w:t>
@@ -1300,6 +1440,9 @@
             <w:pPr>
               <w:pStyle w:val="TableParagraph"/>
               <w:jc w:val="center"/>
+              <w:rPr>
+                <w:color w:val="000000" w:themeColor="text1"/>
+              </w:rPr>
             </w:pPr>
           </w:p>
         </w:tc>
@@ -1312,15 +1455,20 @@
               <w:pStyle w:val="TableParagraph"/>
               <w:spacing w:line="252" w:lineRule="exact"/>
               <w:ind w:left="111"/>
-            </w:pPr>
-            <w:r>
-              <w:rPr>
+              <w:rPr>
+                <w:color w:val="000000" w:themeColor="text1"/>
+              </w:rPr>
+            </w:pPr>
+            <w:r>
+              <w:rPr>
+                <w:color w:val="000000" w:themeColor="text1"/>
                 <w:sz w:val="24"/>
               </w:rPr>
               <w:t>Nilai</w:t>
             </w:r>
             <w:r>
               <w:rPr>
+                <w:color w:val="000000" w:themeColor="text1"/>
                 <w:spacing w:val="-6"/>
                 <w:sz w:val="24"/>
               </w:rPr>
@@ -1328,12 +1476,14 @@
             </w:r>
             <w:r>
               <w:rPr>
+                <w:color w:val="000000" w:themeColor="text1"/>
                 <w:sz w:val="24"/>
               </w:rPr>
               <w:t>rata-rata</w:t>
             </w:r>
             <w:r>
               <w:rPr>
+                <w:color w:val="000000" w:themeColor="text1"/>
                 <w:spacing w:val="-5"/>
                 <w:sz w:val="24"/>
               </w:rPr>
@@ -1341,12 +1491,14 @@
             </w:r>
             <w:r>
               <w:rPr>
+                <w:color w:val="000000" w:themeColor="text1"/>
                 <w:sz w:val="24"/>
               </w:rPr>
               <w:t>dari</w:t>
             </w:r>
             <w:r>
               <w:rPr>
+                <w:color w:val="000000" w:themeColor="text1"/>
                 <w:spacing w:val="-5"/>
                 <w:sz w:val="24"/>
               </w:rPr>
@@ -1354,12 +1506,14 @@
             </w:r>
             <w:r>
               <w:rPr>
+                <w:color w:val="000000" w:themeColor="text1"/>
                 <w:sz w:val="24"/>
               </w:rPr>
               <w:t>kolom</w:t>
             </w:r>
             <w:r>
               <w:rPr>
+                <w:color w:val="000000" w:themeColor="text1"/>
                 <w:spacing w:val="-5"/>
                 <w:sz w:val="24"/>
               </w:rPr>
@@ -1367,12 +1521,14 @@
             </w:r>
             <w:r>
               <w:rPr>
+                <w:color w:val="000000" w:themeColor="text1"/>
                 <w:sz w:val="24"/>
               </w:rPr>
               <w:t>(3)</w:t>
             </w:r>
             <w:r>
               <w:rPr>
+                <w:color w:val="000000" w:themeColor="text1"/>
                 <w:spacing w:val="-7"/>
                 <w:sz w:val="24"/>
               </w:rPr>
@@ -1380,12 +1536,14 @@
             </w:r>
             <w:r>
               <w:rPr>
+                <w:color w:val="000000" w:themeColor="text1"/>
                 <w:sz w:val="24"/>
               </w:rPr>
               <w:t>No.</w:t>
             </w:r>
             <w:r>
               <w:rPr>
+                <w:color w:val="000000" w:themeColor="text1"/>
                 <w:spacing w:val="-5"/>
                 <w:sz w:val="24"/>
               </w:rPr>
@@ -1393,12 +1551,14 @@
             </w:r>
             <w:r>
               <w:rPr>
+                <w:color w:val="000000" w:themeColor="text1"/>
                 <w:sz w:val="24"/>
               </w:rPr>
               <w:t>1</w:t>
             </w:r>
             <w:r>
               <w:rPr>
+                <w:color w:val="000000" w:themeColor="text1"/>
                 <w:spacing w:val="-4"/>
                 <w:sz w:val="24"/>
               </w:rPr>
@@ -1406,12 +1566,14 @@
             </w:r>
             <w:r>
               <w:rPr>
+                <w:color w:val="000000" w:themeColor="text1"/>
                 <w:sz w:val="24"/>
               </w:rPr>
               <w:t>–</w:t>
             </w:r>
             <w:r>
               <w:rPr>
+                <w:color w:val="000000" w:themeColor="text1"/>
                 <w:spacing w:val="-5"/>
                 <w:sz w:val="24"/>
               </w:rPr>
@@ -1419,6 +1581,7 @@
             </w:r>
             <w:r>
               <w:rPr>
+                <w:color w:val="000000" w:themeColor="text1"/>
                 <w:spacing w:val="-10"/>
                 <w:sz w:val="24"/>
               </w:rPr>
@@ -1439,8 +1602,14 @@
             <w:pPr>
               <w:pStyle w:val="TableParagraph"/>
               <w:jc w:val="center"/>
-            </w:pPr>
-            <w:r>
+              <w:rPr>
+                <w:color w:val="000000" w:themeColor="text1"/>
+              </w:rPr>
+            </w:pPr>
+            <w:r>
+              <w:rPr>
+                <w:color w:val="000000" w:themeColor="text1"/>
+              </w:rPr>
               <w:t>8</w:t>
             </w:r>
           </w:p>
@@ -1454,10 +1623,14 @@
               <w:pStyle w:val="TableParagraph"/>
               <w:spacing w:line="251" w:lineRule="exact"/>
               <w:ind w:left="110"/>
+              <w:rPr>
+                <w:color w:val="000000" w:themeColor="text1"/>
+              </w:rPr>
             </w:pPr>
             <w:r>
               <w:rPr>
                 <w:b/>
+                <w:color w:val="000000" w:themeColor="text1"/>
                 <w:sz w:val="24"/>
               </w:rPr>
               <w:t>Nilai</w:t>
@@ -1465,6 +1638,7 @@
             <w:r>
               <w:rPr>
                 <w:b/>
+                <w:color w:val="000000" w:themeColor="text1"/>
                 <w:spacing w:val="-5"/>
                 <w:sz w:val="24"/>
               </w:rPr>
@@ -1473,6 +1647,7 @@
             <w:r>
               <w:rPr>
                 <w:b/>
+                <w:color w:val="000000" w:themeColor="text1"/>
                 <w:sz w:val="24"/>
               </w:rPr>
               <w:t>akhir</w:t>
@@ -1480,6 +1655,7 @@
             <w:r>
               <w:rPr>
                 <w:b/>
+                <w:color w:val="000000" w:themeColor="text1"/>
                 <w:spacing w:val="-4"/>
                 <w:sz w:val="24"/>
               </w:rPr>
@@ -1488,6 +1664,7 @@
             <w:r>
               <w:rPr>
                 <w:b/>
+                <w:color w:val="000000" w:themeColor="text1"/>
                 <w:spacing w:val="-2"/>
                 <w:sz w:val="24"/>
               </w:rPr>
@@ -1496,6 +1673,7 @@
             <w:r>
               <w:rPr>
                 <w:b/>
+                <w:color w:val="000000" w:themeColor="text1"/>
                 <w:spacing w:val="-2"/>
                 <w:position w:val="8"/>
                 <w:sz w:val="16"/>
@@ -1512,6 +1690,9 @@
             <w:pPr>
               <w:pStyle w:val="TableParagraph"/>
               <w:jc w:val="center"/>
+              <w:rPr>
+                <w:color w:val="000000" w:themeColor="text1"/>
+              </w:rPr>
             </w:pPr>
           </w:p>
         </w:tc>
@@ -1524,6 +1705,9 @@
               <w:pStyle w:val="TableParagraph"/>
               <w:spacing w:before="1" w:line="280" w:lineRule="atLeast"/>
               <w:ind w:left="121" w:right="364" w:hanging="10"/>
+              <w:rPr>
+                <w:color w:val="000000" w:themeColor="text1"/>
+              </w:rPr>
             </w:pPr>
           </w:p>
         </w:tc>
@@ -1536,11 +1720,13 @@
         <w:ind w:left="360" w:hanging="360"/>
         <w:rPr>
           <w:rFonts w:ascii="Times New Roman" w:hAnsi="Times New Roman" w:cs="Times New Roman"/>
+          <w:color w:val="000000" w:themeColor="text1"/>
         </w:rPr>
       </w:pPr>
       <w:r>
         <w:rPr>
           <w:b/>
+          <w:color w:val="000000" w:themeColor="text1"/>
           <w:spacing w:val="-5"/>
         </w:rPr>
         <w:t>*)</w:t>
@@ -1548,18 +1734,21 @@
       <w:r>
         <w:rPr>
           <w:b/>
+          <w:color w:val="000000" w:themeColor="text1"/>
         </w:rPr>
         <w:tab/>
       </w:r>
       <w:r>
         <w:rPr>
           <w:rFonts w:ascii="Times New Roman" w:hAnsi="Times New Roman" w:cs="Times New Roman"/>
+          <w:color w:val="000000" w:themeColor="text1"/>
         </w:rPr>
         <w:t>Mata</w:t>
       </w:r>
       <w:r>
         <w:rPr>
           <w:rFonts w:ascii="Times New Roman" w:hAnsi="Times New Roman" w:cs="Times New Roman"/>
+          <w:color w:val="000000" w:themeColor="text1"/>
           <w:spacing w:val="-4"/>
         </w:rPr>
         <w:t xml:space="preserve"> </w:t>
@@ -1567,12 +1756,14 @@
       <w:r>
         <w:rPr>
           <w:rFonts w:ascii="Times New Roman" w:hAnsi="Times New Roman" w:cs="Times New Roman"/>
+          <w:color w:val="000000" w:themeColor="text1"/>
         </w:rPr>
         <w:t>Kuliah</w:t>
       </w:r>
       <w:r>
         <w:rPr>
           <w:rFonts w:ascii="Times New Roman" w:hAnsi="Times New Roman" w:cs="Times New Roman"/>
+          <w:color w:val="000000" w:themeColor="text1"/>
           <w:spacing w:val="-4"/>
         </w:rPr>
         <w:t xml:space="preserve"> </w:t>
@@ -1580,12 +1771,14 @@
       <w:r>
         <w:rPr>
           <w:rFonts w:ascii="Times New Roman" w:hAnsi="Times New Roman" w:cs="Times New Roman"/>
+          <w:color w:val="000000" w:themeColor="text1"/>
         </w:rPr>
         <w:t>(MK)</w:t>
       </w:r>
       <w:r>
         <w:rPr>
           <w:rFonts w:ascii="Times New Roman" w:hAnsi="Times New Roman" w:cs="Times New Roman"/>
+          <w:color w:val="000000" w:themeColor="text1"/>
           <w:spacing w:val="-5"/>
         </w:rPr>
         <w:t xml:space="preserve"> </w:t>
@@ -1593,12 +1786,14 @@
       <w:r>
         <w:rPr>
           <w:rFonts w:ascii="Times New Roman" w:hAnsi="Times New Roman" w:cs="Times New Roman"/>
+          <w:color w:val="000000" w:themeColor="text1"/>
         </w:rPr>
         <w:t>Sidang</w:t>
       </w:r>
       <w:r>
         <w:rPr>
           <w:rFonts w:ascii="Times New Roman" w:hAnsi="Times New Roman" w:cs="Times New Roman"/>
+          <w:color w:val="000000" w:themeColor="text1"/>
           <w:spacing w:val="-3"/>
         </w:rPr>
         <w:t xml:space="preserve"> </w:t>
@@ -1606,6 +1801,7 @@
       <w:r>
         <w:rPr>
           <w:rFonts w:ascii="Times New Roman" w:hAnsi="Times New Roman" w:cs="Times New Roman"/>
+          <w:color w:val="000000" w:themeColor="text1"/>
           <w:spacing w:val="-2"/>
         </w:rPr>
         <w:t>Doktor</w:t>
@@ -1617,17 +1813,20 @@
         <w:ind w:left="360" w:right="3401"/>
         <w:rPr>
           <w:rFonts w:ascii="Times New Roman" w:hAnsi="Times New Roman" w:cs="Times New Roman"/>
-        </w:rPr>
-      </w:pPr>
-      <w:r>
-        <w:rPr>
-          <w:rFonts w:ascii="Times New Roman" w:hAnsi="Times New Roman" w:cs="Times New Roman"/>
+          <w:color w:val="000000" w:themeColor="text1"/>
+        </w:rPr>
+      </w:pPr>
+      <w:r>
+        <w:rPr>
+          <w:rFonts w:ascii="Times New Roman" w:hAnsi="Times New Roman" w:cs="Times New Roman"/>
+          <w:color w:val="000000" w:themeColor="text1"/>
         </w:rPr>
         <w:t>Indeks</w:t>
       </w:r>
       <w:r>
         <w:rPr>
           <w:rFonts w:ascii="Times New Roman" w:hAnsi="Times New Roman" w:cs="Times New Roman"/>
+          <w:color w:val="000000" w:themeColor="text1"/>
           <w:spacing w:val="-3"/>
         </w:rPr>
         <w:t xml:space="preserve"> </w:t>
@@ -1635,12 +1834,14 @@
       <w:r>
         <w:rPr>
           <w:rFonts w:ascii="Times New Roman" w:hAnsi="Times New Roman" w:cs="Times New Roman"/>
+          <w:color w:val="000000" w:themeColor="text1"/>
         </w:rPr>
         <w:t>A,</w:t>
       </w:r>
       <w:r>
         <w:rPr>
           <w:rFonts w:ascii="Times New Roman" w:hAnsi="Times New Roman" w:cs="Times New Roman"/>
+          <w:color w:val="000000" w:themeColor="text1"/>
           <w:spacing w:val="-4"/>
         </w:rPr>
         <w:t xml:space="preserve"> </w:t>
@@ -1648,12 +1849,14 @@
       <w:r>
         <w:rPr>
           <w:rFonts w:ascii="Times New Roman" w:hAnsi="Times New Roman" w:cs="Times New Roman"/>
+          <w:color w:val="000000" w:themeColor="text1"/>
         </w:rPr>
         <w:t>jika</w:t>
       </w:r>
       <w:r>
         <w:rPr>
           <w:rFonts w:ascii="Times New Roman" w:hAnsi="Times New Roman" w:cs="Times New Roman"/>
+          <w:color w:val="000000" w:themeColor="text1"/>
           <w:spacing w:val="-4"/>
         </w:rPr>
         <w:t xml:space="preserve"> </w:t>
@@ -1661,12 +1864,14 @@
       <w:r>
         <w:rPr>
           <w:rFonts w:ascii="Times New Roman" w:hAnsi="Times New Roman" w:cs="Times New Roman"/>
+          <w:color w:val="000000" w:themeColor="text1"/>
         </w:rPr>
         <w:t>NA</w:t>
       </w:r>
       <w:r>
         <w:rPr>
           <w:rFonts w:ascii="Times New Roman" w:hAnsi="Times New Roman" w:cs="Times New Roman"/>
+          <w:color w:val="000000" w:themeColor="text1"/>
           <w:spacing w:val="-4"/>
         </w:rPr>
         <w:t xml:space="preserve"> </w:t>
@@ -1674,12 +1879,14 @@
       <w:r>
         <w:rPr>
           <w:rFonts w:ascii="Times New Roman" w:hAnsi="Times New Roman" w:cs="Times New Roman"/>
+          <w:color w:val="000000" w:themeColor="text1"/>
         </w:rPr>
         <w:t>≥</w:t>
       </w:r>
       <w:r>
         <w:rPr>
           <w:rFonts w:ascii="Times New Roman" w:hAnsi="Times New Roman" w:cs="Times New Roman"/>
+          <w:color w:val="000000" w:themeColor="text1"/>
           <w:spacing w:val="-3"/>
         </w:rPr>
         <w:t xml:space="preserve"> </w:t>
@@ -1687,12 +1894,14 @@
       <w:r>
         <w:rPr>
           <w:rFonts w:ascii="Times New Roman" w:hAnsi="Times New Roman" w:cs="Times New Roman"/>
+          <w:color w:val="000000" w:themeColor="text1"/>
         </w:rPr>
         <w:t>4,5;</w:t>
       </w:r>
       <w:r>
         <w:rPr>
           <w:rFonts w:ascii="Times New Roman" w:hAnsi="Times New Roman" w:cs="Times New Roman"/>
+          <w:color w:val="000000" w:themeColor="text1"/>
           <w:spacing w:val="-1"/>
         </w:rPr>
         <w:t xml:space="preserve"> </w:t>
@@ -1700,12 +1909,14 @@
       <w:r>
         <w:rPr>
           <w:rFonts w:ascii="Times New Roman" w:hAnsi="Times New Roman" w:cs="Times New Roman"/>
+          <w:color w:val="000000" w:themeColor="text1"/>
         </w:rPr>
         <w:t>Indeks</w:t>
       </w:r>
       <w:r>
         <w:rPr>
           <w:rFonts w:ascii="Times New Roman" w:hAnsi="Times New Roman" w:cs="Times New Roman"/>
+          <w:color w:val="000000" w:themeColor="text1"/>
           <w:spacing w:val="-3"/>
         </w:rPr>
         <w:t xml:space="preserve"> </w:t>
@@ -1713,12 +1924,14 @@
       <w:r>
         <w:rPr>
           <w:rFonts w:ascii="Times New Roman" w:hAnsi="Times New Roman" w:cs="Times New Roman"/>
+          <w:color w:val="000000" w:themeColor="text1"/>
         </w:rPr>
         <w:t>AB,</w:t>
       </w:r>
       <w:r>
         <w:rPr>
           <w:rFonts w:ascii="Times New Roman" w:hAnsi="Times New Roman" w:cs="Times New Roman"/>
+          <w:color w:val="000000" w:themeColor="text1"/>
           <w:spacing w:val="-3"/>
         </w:rPr>
         <w:t xml:space="preserve"> </w:t>
@@ -1726,12 +1939,14 @@
       <w:r>
         <w:rPr>
           <w:rFonts w:ascii="Times New Roman" w:hAnsi="Times New Roman" w:cs="Times New Roman"/>
+          <w:color w:val="000000" w:themeColor="text1"/>
         </w:rPr>
         <w:t>jika</w:t>
       </w:r>
       <w:r>
         <w:rPr>
           <w:rFonts w:ascii="Times New Roman" w:hAnsi="Times New Roman" w:cs="Times New Roman"/>
+          <w:color w:val="000000" w:themeColor="text1"/>
           <w:spacing w:val="-3"/>
         </w:rPr>
         <w:t xml:space="preserve"> </w:t>
@@ -1739,12 +1954,14 @@
       <w:r>
         <w:rPr>
           <w:rFonts w:ascii="Times New Roman" w:hAnsi="Times New Roman" w:cs="Times New Roman"/>
+          <w:color w:val="000000" w:themeColor="text1"/>
         </w:rPr>
         <w:t>4,0</w:t>
       </w:r>
       <w:r>
         <w:rPr>
           <w:rFonts w:ascii="Times New Roman" w:hAnsi="Times New Roman" w:cs="Times New Roman"/>
+          <w:color w:val="000000" w:themeColor="text1"/>
           <w:spacing w:val="-3"/>
         </w:rPr>
         <w:t xml:space="preserve"> </w:t>
@@ -1752,12 +1969,14 @@
       <w:r>
         <w:rPr>
           <w:rFonts w:ascii="Times New Roman" w:hAnsi="Times New Roman" w:cs="Times New Roman"/>
+          <w:color w:val="000000" w:themeColor="text1"/>
         </w:rPr>
         <w:t>≤</w:t>
       </w:r>
       <w:r>
         <w:rPr>
           <w:rFonts w:ascii="Times New Roman" w:hAnsi="Times New Roman" w:cs="Times New Roman"/>
+          <w:color w:val="000000" w:themeColor="text1"/>
           <w:spacing w:val="-3"/>
         </w:rPr>
         <w:t xml:space="preserve"> </w:t>
@@ -1765,12 +1984,14 @@
       <w:r>
         <w:rPr>
           <w:rFonts w:ascii="Times New Roman" w:hAnsi="Times New Roman" w:cs="Times New Roman"/>
+          <w:color w:val="000000" w:themeColor="text1"/>
         </w:rPr>
         <w:t>NA</w:t>
       </w:r>
       <w:r>
         <w:rPr>
           <w:rFonts w:ascii="Times New Roman" w:hAnsi="Times New Roman" w:cs="Times New Roman"/>
+          <w:color w:val="000000" w:themeColor="text1"/>
           <w:spacing w:val="-4"/>
         </w:rPr>
         <w:t xml:space="preserve"> </w:t>
@@ -1778,12 +1999,14 @@
       <w:r>
         <w:rPr>
           <w:rFonts w:ascii="Times New Roman" w:hAnsi="Times New Roman" w:cs="Times New Roman"/>
+          <w:color w:val="000000" w:themeColor="text1"/>
         </w:rPr>
         <w:t>&lt;</w:t>
       </w:r>
       <w:r>
         <w:rPr>
           <w:rFonts w:ascii="Times New Roman" w:hAnsi="Times New Roman" w:cs="Times New Roman"/>
+          <w:color w:val="000000" w:themeColor="text1"/>
           <w:spacing w:val="-5"/>
         </w:rPr>
         <w:t xml:space="preserve"> </w:t>
@@ -1791,6 +2014,7 @@
       <w:r>
         <w:rPr>
           <w:rFonts w:ascii="Times New Roman" w:hAnsi="Times New Roman" w:cs="Times New Roman"/>
+          <w:color w:val="000000" w:themeColor="text1"/>
         </w:rPr>
         <w:t>4,5; Indeks B, jika jika 3,5 ≤ NA &lt; 4,0;</w:t>
       </w:r>
@@ -1803,6 +2027,7 @@
         <w:rPr>
           <w:rFonts w:ascii="Times New Roman" w:hAnsi="Times New Roman" w:cs="Times New Roman"/>
           <w:b/>
+          <w:color w:val="000000" w:themeColor="text1"/>
           <w:sz w:val="22"/>
           <w:lang w:val="fi-FI"/>
         </w:rPr>
@@ -1810,6 +2035,7 @@
       <w:r>
         <w:rPr>
           <w:rFonts w:ascii="Times New Roman" w:hAnsi="Times New Roman" w:cs="Times New Roman"/>
+          <w:color w:val="000000" w:themeColor="text1"/>
           <w:lang w:val="fi-FI"/>
         </w:rPr>
         <w:t>Mengulang</w:t>
@@ -1817,6 +2043,7 @@
       <w:r>
         <w:rPr>
           <w:rFonts w:ascii="Times New Roman" w:hAnsi="Times New Roman" w:cs="Times New Roman"/>
+          <w:color w:val="000000" w:themeColor="text1"/>
           <w:spacing w:val="-7"/>
           <w:lang w:val="fi-FI"/>
         </w:rPr>
@@ -1825,6 +2052,7 @@
       <w:r>
         <w:rPr>
           <w:rFonts w:ascii="Times New Roman" w:hAnsi="Times New Roman" w:cs="Times New Roman"/>
+          <w:color w:val="000000" w:themeColor="text1"/>
           <w:lang w:val="fi-FI"/>
         </w:rPr>
         <w:t>jika</w:t>
@@ -1832,6 +2060,7 @@
       <w:r>
         <w:rPr>
           <w:rFonts w:ascii="Times New Roman" w:hAnsi="Times New Roman" w:cs="Times New Roman"/>
+          <w:color w:val="000000" w:themeColor="text1"/>
           <w:spacing w:val="-7"/>
           <w:lang w:val="fi-FI"/>
         </w:rPr>
@@ -1840,6 +2069,7 @@
       <w:r>
         <w:rPr>
           <w:rFonts w:ascii="Times New Roman" w:hAnsi="Times New Roman" w:cs="Times New Roman"/>
+          <w:color w:val="000000" w:themeColor="text1"/>
           <w:lang w:val="fi-FI"/>
         </w:rPr>
         <w:t>NA</w:t>
@@ -1847,6 +2077,7 @@
       <w:r>
         <w:rPr>
           <w:rFonts w:ascii="Times New Roman" w:hAnsi="Times New Roman" w:cs="Times New Roman"/>
+          <w:color w:val="000000" w:themeColor="text1"/>
           <w:spacing w:val="-7"/>
           <w:lang w:val="fi-FI"/>
         </w:rPr>
@@ -1855,6 +2086,7 @@
       <w:r>
         <w:rPr>
           <w:rFonts w:ascii="Times New Roman" w:hAnsi="Times New Roman" w:cs="Times New Roman"/>
+          <w:color w:val="000000" w:themeColor="text1"/>
           <w:lang w:val="fi-FI"/>
         </w:rPr>
         <w:t>kurang</w:t>
@@ -1862,6 +2094,7 @@
       <w:r>
         <w:rPr>
           <w:rFonts w:ascii="Times New Roman" w:hAnsi="Times New Roman" w:cs="Times New Roman"/>
+          <w:color w:val="000000" w:themeColor="text1"/>
           <w:spacing w:val="-7"/>
           <w:lang w:val="fi-FI"/>
         </w:rPr>
@@ -1870,6 +2103,7 @@
       <w:r>
         <w:rPr>
           <w:rFonts w:ascii="Times New Roman" w:hAnsi="Times New Roman" w:cs="Times New Roman"/>
+          <w:color w:val="000000" w:themeColor="text1"/>
           <w:lang w:val="fi-FI"/>
         </w:rPr>
         <w:t>dari</w:t>
@@ -1877,6 +2111,7 @@
       <w:r>
         <w:rPr>
           <w:rFonts w:ascii="Times New Roman" w:hAnsi="Times New Roman" w:cs="Times New Roman"/>
+          <w:color w:val="000000" w:themeColor="text1"/>
           <w:spacing w:val="-7"/>
           <w:lang w:val="fi-FI"/>
         </w:rPr>
@@ -1885,6 +2120,7 @@
       <w:r>
         <w:rPr>
           <w:rFonts w:ascii="Times New Roman" w:hAnsi="Times New Roman" w:cs="Times New Roman"/>
+          <w:color w:val="000000" w:themeColor="text1"/>
           <w:lang w:val="fi-FI"/>
         </w:rPr>
         <w:t>3,5</w:t>
@@ -1898,6 +2134,7 @@
         <w:rPr>
           <w:rFonts w:ascii="Times New Roman" w:hAnsi="Times New Roman" w:cs="Times New Roman"/>
           <w:b/>
+          <w:color w:val="000000" w:themeColor="text1"/>
           <w:sz w:val="22"/>
           <w:lang w:val="fi-FI"/>
         </w:rPr>
@@ -1912,6 +2149,7 @@
           <w:rFonts w:ascii="Times New Roman" w:hAnsi="Times New Roman" w:cs="Times New Roman"/>
           <w:b/>
           <w:bCs/>
+          <w:color w:val="000000" w:themeColor="text1"/>
         </w:rPr>
       </w:pPr>
       <w:r>
@@ -1919,6 +2157,7 @@
           <w:rFonts w:ascii="Times New Roman" w:hAnsi="Times New Roman" w:cs="Times New Roman"/>
           <w:b/>
           <w:bCs/>
+          <w:color w:val="000000" w:themeColor="text1"/>
         </w:rPr>
         <w:t>Capaian akademik:</w:t>
       </w:r>
@@ -1939,105 +2178,135 @@
         <w:autoSpaceDN w:val="0"/>
         <w:ind w:left="360" w:firstLine="0"/>
         <w:contextualSpacing w:val="0"/>
-      </w:pPr>
-      <w:r>
+        <w:rPr>
+          <w:color w:val="000000" w:themeColor="text1"/>
+        </w:rPr>
+      </w:pPr>
+      <w:r>
+        <w:rPr>
+          <w:color w:val="000000" w:themeColor="text1"/>
+        </w:rPr>
         <w:t>Indeks</w:t>
       </w:r>
       <w:r>
         <w:rPr>
+          <w:color w:val="000000" w:themeColor="text1"/>
           <w:spacing w:val="-4"/>
         </w:rPr>
         <w:t xml:space="preserve"> </w:t>
       </w:r>
       <w:r>
+        <w:rPr>
+          <w:color w:val="000000" w:themeColor="text1"/>
+        </w:rPr>
         <w:t>prestasi</w:t>
       </w:r>
       <w:r>
         <w:rPr>
+          <w:color w:val="000000" w:themeColor="text1"/>
           <w:spacing w:val="-4"/>
         </w:rPr>
         <w:t xml:space="preserve"> </w:t>
       </w:r>
       <w:r>
+        <w:rPr>
+          <w:color w:val="000000" w:themeColor="text1"/>
+        </w:rPr>
         <w:t>kumulatif</w:t>
       </w:r>
       <w:r>
         <w:rPr>
+          <w:color w:val="000000" w:themeColor="text1"/>
           <w:spacing w:val="-3"/>
         </w:rPr>
         <w:t xml:space="preserve"> </w:t>
       </w:r>
       <w:r>
         <w:rPr>
+          <w:color w:val="000000" w:themeColor="text1"/>
           <w:spacing w:val="-4"/>
         </w:rPr>
         <w:t>(IP)</w:t>
       </w:r>
       <w:r>
+        <w:rPr>
+          <w:color w:val="000000" w:themeColor="text1"/>
+        </w:rPr>
         <w:tab/>
       </w:r>
       <w:r>
         <w:rPr>
+          <w:color w:val="000000" w:themeColor="text1"/>
           <w:spacing w:val="-10"/>
         </w:rPr>
         <w:t>:</w:t>
       </w:r>
       <w:r>
         <w:rPr>
+          <w:color w:val="000000" w:themeColor="text1"/>
           <w:spacing w:val="-10"/>
         </w:rPr>
         <w:tab/>
       </w:r>
       <w:r>
         <w:rPr>
+          <w:color w:val="000000" w:themeColor="text1"/>
           <w:spacing w:val="-10"/>
         </w:rPr>
         <w:t>3.88</w:t>
       </w:r>
       <w:r>
         <w:rPr>
+          <w:color w:val="000000" w:themeColor="text1"/>
           <w:spacing w:val="-10"/>
         </w:rPr>
         <w:t xml:space="preserve"> </w:t>
       </w:r>
       <w:r>
         <w:rPr>
+          <w:color w:val="000000" w:themeColor="text1"/>
           <w:spacing w:val="-10"/>
         </w:rPr>
         <w:t>(</w:t>
       </w:r>
       <w:r>
         <w:rPr>
+          <w:color w:val="000000" w:themeColor="text1"/>
           <w:spacing w:val="-10"/>
         </w:rPr>
         <w:t>1</w:t>
       </w:r>
       <w:r>
         <w:rPr>
+          <w:color w:val="000000" w:themeColor="text1"/>
           <w:spacing w:val="-10"/>
         </w:rPr>
         <w:t>2</w:t>
       </w:r>
       <w:r>
         <w:rPr>
+          <w:color w:val="000000" w:themeColor="text1"/>
           <w:spacing w:val="-10"/>
         </w:rPr>
         <w:t xml:space="preserve"> </w:t>
       </w:r>
       <w:r>
         <w:rPr>
+          <w:color w:val="000000" w:themeColor="text1"/>
           <w:spacing w:val="-10"/>
         </w:rPr>
         <w:t>Semester</w:t>
       </w:r>
       <w:r>
         <w:rPr>
+          <w:color w:val="000000" w:themeColor="text1"/>
           <w:spacing w:val="-10"/>
         </w:rPr>
         <w:t xml:space="preserve"> </w:t>
       </w:r>
       <w:r>
         <w:rPr>
+          <w:color w:val="000000" w:themeColor="text1"/>
           <w:spacing w:val="-10"/>
         </w:rPr>
         <w:t>)</w:t>
@@ -2060,26 +2329,45 @@
         <w:autoSpaceDN w:val="0"/>
         <w:ind w:left="360" w:firstLine="0"/>
         <w:contextualSpacing w:val="0"/>
-      </w:pPr>
-      <w:r>
+        <w:rPr>
+          <w:color w:val="000000" w:themeColor="text1"/>
+        </w:rPr>
+      </w:pPr>
+      <w:r>
+        <w:rPr>
+          <w:color w:val="000000" w:themeColor="text1"/>
+        </w:rPr>
         <w:t>Jumlah publikasi ilmiah (jurnal bereputasi):</w:t>
       </w:r>
       <w:r>
+        <w:rPr>
+          <w:color w:val="000000" w:themeColor="text1"/>
+        </w:rPr>
         <w:tab/>
       </w:r>
       <w:r>
         <w:rPr>
+          <w:color w:val="000000" w:themeColor="text1"/>
           <w:spacing w:val="-10"/>
         </w:rPr>
         <w:t>:</w:t>
       </w:r>
       <w:r>
+        <w:rPr>
+          <w:color w:val="000000" w:themeColor="text1"/>
+        </w:rPr>
         <w:tab/>
       </w:r>
       <w:r>
+        <w:rPr>
+          <w:color w:val="000000" w:themeColor="text1"/>
+        </w:rPr>
         <w:t>1 jurnal Q1</w:t>
       </w:r>
       <w:r>
+        <w:rPr>
+          <w:color w:val="000000" w:themeColor="text1"/>
+        </w:rPr>
         <w:t xml:space="preserve"> (Published)</w:t>
       </w:r>
     </w:p>
@@ -2100,66 +2388,99 @@
         <w:autoSpaceDN w:val="0"/>
         <w:ind w:left="360" w:firstLine="0"/>
         <w:contextualSpacing w:val="0"/>
-      </w:pPr>
-      <w:r>
+        <w:rPr>
+          <w:color w:val="000000" w:themeColor="text1"/>
+        </w:rPr>
+      </w:pPr>
+      <w:r>
+        <w:rPr>
+          <w:color w:val="000000" w:themeColor="text1"/>
+        </w:rPr>
         <w:t>Jumlah</w:t>
       </w:r>
       <w:r>
         <w:rPr>
+          <w:color w:val="000000" w:themeColor="text1"/>
           <w:spacing w:val="-3"/>
         </w:rPr>
         <w:t xml:space="preserve"> </w:t>
       </w:r>
       <w:r>
+        <w:rPr>
+          <w:color w:val="000000" w:themeColor="text1"/>
+        </w:rPr>
         <w:t>publikasi</w:t>
       </w:r>
       <w:r>
         <w:rPr>
+          <w:color w:val="000000" w:themeColor="text1"/>
           <w:spacing w:val="-3"/>
         </w:rPr>
         <w:t xml:space="preserve"> </w:t>
       </w:r>
       <w:r>
+        <w:rPr>
+          <w:color w:val="000000" w:themeColor="text1"/>
+        </w:rPr>
         <w:t>ilmiah</w:t>
       </w:r>
       <w:r>
         <w:rPr>
+          <w:color w:val="000000" w:themeColor="text1"/>
           <w:spacing w:val="-2"/>
         </w:rPr>
         <w:t xml:space="preserve"> </w:t>
       </w:r>
       <w:r>
+        <w:rPr>
+          <w:color w:val="000000" w:themeColor="text1"/>
+        </w:rPr>
         <w:t>(selain</w:t>
       </w:r>
       <w:r>
         <w:rPr>
+          <w:color w:val="000000" w:themeColor="text1"/>
           <w:spacing w:val="-3"/>
         </w:rPr>
         <w:t xml:space="preserve"> </w:t>
       </w:r>
       <w:r>
+        <w:rPr>
+          <w:color w:val="000000" w:themeColor="text1"/>
+        </w:rPr>
         <w:t>jurnal</w:t>
       </w:r>
       <w:r>
         <w:rPr>
+          <w:color w:val="000000" w:themeColor="text1"/>
           <w:spacing w:val="-2"/>
         </w:rPr>
         <w:t xml:space="preserve"> bereputasi)</w:t>
       </w:r>
       <w:r>
+        <w:rPr>
+          <w:color w:val="000000" w:themeColor="text1"/>
+        </w:rPr>
         <w:tab/>
       </w:r>
       <w:r>
         <w:rPr>
+          <w:color w:val="000000" w:themeColor="text1"/>
           <w:spacing w:val="-10"/>
         </w:rPr>
         <w:t>:</w:t>
       </w:r>
       <w:r>
+        <w:rPr>
+          <w:color w:val="000000" w:themeColor="text1"/>
+        </w:rPr>
         <w:tab/>
         <w:t xml:space="preserve"> </w:t>
       </w:r>
       <w:r>
+        <w:rPr>
+          <w:color w:val="000000" w:themeColor="text1"/>
+        </w:rPr>
         <w:t>---</w:t>
       </w:r>
     </w:p>
@@ -2180,17 +2501,32 @@
         <w:autoSpaceDN w:val="0"/>
         <w:ind w:left="360" w:firstLine="0"/>
         <w:contextualSpacing w:val="0"/>
-      </w:pPr>
-      <w:r>
+        <w:rPr>
+          <w:color w:val="000000" w:themeColor="text1"/>
+        </w:rPr>
+      </w:pPr>
+      <w:r>
+        <w:rPr>
+          <w:color w:val="000000" w:themeColor="text1"/>
+        </w:rPr>
         <w:t>Jumlah publikasi ilmiah (selain jurnal bereputasi)</w:t>
       </w:r>
       <w:r>
+        <w:rPr>
+          <w:color w:val="000000" w:themeColor="text1"/>
+        </w:rPr>
         <w:tab/>
       </w:r>
       <w:r>
+        <w:rPr>
+          <w:color w:val="000000" w:themeColor="text1"/>
+        </w:rPr>
         <w:t>:</w:t>
       </w:r>
       <w:r>
+        <w:rPr>
+          <w:color w:val="000000" w:themeColor="text1"/>
+        </w:rPr>
         <w:tab/>
         <w:t>---</w:t>
       </w:r>
@@ -2202,6 +2538,7 @@
         <w:ind w:left="0"/>
         <w:rPr>
           <w:b/>
+          <w:color w:val="000000" w:themeColor="text1"/>
           <w:sz w:val="22"/>
         </w:rPr>
       </w:pPr>
@@ -2211,81 +2548,117 @@
         <w:pStyle w:val="Heading4"/>
         <w:ind w:left="0" w:firstLine="0"/>
         <w:jc w:val="left"/>
-      </w:pPr>
-      <w:r>
+        <w:rPr>
+          <w:color w:val="000000" w:themeColor="text1"/>
+        </w:rPr>
+      </w:pPr>
+      <w:r>
+        <w:rPr>
+          <w:color w:val="000000" w:themeColor="text1"/>
+        </w:rPr>
         <w:t>Tim</w:t>
       </w:r>
       <w:r>
         <w:rPr>
+          <w:color w:val="000000" w:themeColor="text1"/>
           <w:spacing w:val="-7"/>
         </w:rPr>
         <w:t xml:space="preserve"> </w:t>
       </w:r>
       <w:r>
+        <w:rPr>
+          <w:color w:val="000000" w:themeColor="text1"/>
+        </w:rPr>
         <w:t>Penguji/</w:t>
       </w:r>
       <w:r>
         <w:rPr>
+          <w:color w:val="000000" w:themeColor="text1"/>
           <w:spacing w:val="-8"/>
         </w:rPr>
         <w:t xml:space="preserve"> </w:t>
       </w:r>
       <w:r>
+        <w:rPr>
+          <w:color w:val="000000" w:themeColor="text1"/>
+        </w:rPr>
         <w:t>Penilai</w:t>
       </w:r>
       <w:r>
         <w:rPr>
+          <w:color w:val="000000" w:themeColor="text1"/>
           <w:spacing w:val="-7"/>
         </w:rPr>
         <w:t xml:space="preserve"> </w:t>
       </w:r>
       <w:r>
+        <w:rPr>
+          <w:color w:val="000000" w:themeColor="text1"/>
+        </w:rPr>
         <w:t>sepakat</w:t>
       </w:r>
       <w:r>
         <w:rPr>
+          <w:color w:val="000000" w:themeColor="text1"/>
           <w:spacing w:val="-8"/>
         </w:rPr>
         <w:t xml:space="preserve"> </w:t>
       </w:r>
       <w:r>
+        <w:rPr>
+          <w:color w:val="000000" w:themeColor="text1"/>
+        </w:rPr>
         <w:t>bahwa</w:t>
       </w:r>
       <w:r>
         <w:rPr>
+          <w:color w:val="000000" w:themeColor="text1"/>
           <w:spacing w:val="-10"/>
         </w:rPr>
         <w:t xml:space="preserve"> </w:t>
       </w:r>
       <w:r>
+        <w:rPr>
+          <w:color w:val="000000" w:themeColor="text1"/>
+        </w:rPr>
         <w:t>mahasiswa</w:t>
       </w:r>
       <w:r>
         <w:rPr>
+          <w:color w:val="000000" w:themeColor="text1"/>
           <w:spacing w:val="-7"/>
         </w:rPr>
         <w:t xml:space="preserve"> </w:t>
       </w:r>
       <w:r>
+        <w:rPr>
+          <w:color w:val="000000" w:themeColor="text1"/>
+        </w:rPr>
         <w:t>yang</w:t>
       </w:r>
       <w:r>
         <w:rPr>
+          <w:color w:val="000000" w:themeColor="text1"/>
           <w:spacing w:val="-7"/>
         </w:rPr>
         <w:t xml:space="preserve"> </w:t>
       </w:r>
       <w:r>
+        <w:rPr>
+          <w:color w:val="000000" w:themeColor="text1"/>
+        </w:rPr>
         <w:t>bersangkutan</w:t>
       </w:r>
       <w:r>
         <w:rPr>
+          <w:color w:val="000000" w:themeColor="text1"/>
           <w:spacing w:val="-10"/>
         </w:rPr>
         <w:t xml:space="preserve"> </w:t>
       </w:r>
       <w:r>
         <w:rPr>
+          <w:color w:val="000000" w:themeColor="text1"/>
           <w:spacing w:val="-2"/>
         </w:rPr>
         <w:t>dinyatakan</w:t>
@@ -2300,12 +2673,14 @@
         <w:ind w:left="0"/>
         <w:rPr>
           <w:rFonts w:ascii="Times New Roman" w:hAnsi="Times New Roman" w:cs="Times New Roman"/>
+          <w:color w:val="000000" w:themeColor="text1"/>
           <w:lang w:val="fi-FI"/>
         </w:rPr>
       </w:pPr>
       <w:r>
         <w:rPr>
           <w:rFonts w:ascii="Times New Roman" w:hAnsi="Times New Roman" w:cs="Times New Roman"/>
+          <w:color w:val="000000" w:themeColor="text1"/>
           <w:lang w:val="fi-FI"/>
         </w:rPr>
         <w:t>(beri</w:t>
@@ -2313,6 +2688,7 @@
       <w:r>
         <w:rPr>
           <w:rFonts w:ascii="Times New Roman" w:hAnsi="Times New Roman" w:cs="Times New Roman"/>
+          <w:color w:val="000000" w:themeColor="text1"/>
           <w:spacing w:val="-8"/>
           <w:lang w:val="fi-FI"/>
         </w:rPr>
@@ -2321,6 +2697,7 @@
       <w:r>
         <w:rPr>
           <w:rFonts w:ascii="Times New Roman" w:hAnsi="Times New Roman" w:cs="Times New Roman"/>
+          <w:color w:val="000000" w:themeColor="text1"/>
           <w:spacing w:val="-2"/>
           <w:lang w:val="fi-FI"/>
         </w:rPr>
@@ -2329,6 +2706,7 @@
       <w:r>
         <w:rPr>
           <w:rFonts w:ascii="Times New Roman" w:hAnsi="Times New Roman" w:cs="Times New Roman"/>
+          <w:color w:val="000000" w:themeColor="text1"/>
           <w:lang w:val="fi-FI"/>
         </w:rPr>
         <w:tab/>
@@ -2337,6 +2715,7 @@
       <w:r>
         <w:rPr>
           <w:rFonts w:ascii="Times New Roman" w:hAnsi="Times New Roman" w:cs="Times New Roman"/>
+          <w:color w:val="000000" w:themeColor="text1"/>
           <w:spacing w:val="-8"/>
           <w:lang w:val="fi-FI"/>
         </w:rPr>
@@ -2345,6 +2724,7 @@
       <w:r>
         <w:rPr>
           <w:rFonts w:ascii="Times New Roman" w:hAnsi="Times New Roman" w:cs="Times New Roman"/>
+          <w:color w:val="000000" w:themeColor="text1"/>
           <w:lang w:val="fi-FI"/>
         </w:rPr>
         <w:t>kotak</w:t>
@@ -2352,6 +2732,7 @@
       <w:r>
         <w:rPr>
           <w:rFonts w:ascii="Times New Roman" w:hAnsi="Times New Roman" w:cs="Times New Roman"/>
+          <w:color w:val="000000" w:themeColor="text1"/>
           <w:spacing w:val="-5"/>
           <w:lang w:val="fi-FI"/>
         </w:rPr>
@@ -2360,6 +2741,7 @@
       <w:r>
         <w:rPr>
           <w:rFonts w:ascii="Times New Roman" w:hAnsi="Times New Roman" w:cs="Times New Roman"/>
+          <w:color w:val="000000" w:themeColor="text1"/>
           <w:lang w:val="fi-FI"/>
         </w:rPr>
         <w:t>yang</w:t>
@@ -2367,6 +2749,7 @@
       <w:r>
         <w:rPr>
           <w:rFonts w:ascii="Times New Roman" w:hAnsi="Times New Roman" w:cs="Times New Roman"/>
+          <w:color w:val="000000" w:themeColor="text1"/>
           <w:spacing w:val="-6"/>
           <w:lang w:val="fi-FI"/>
         </w:rPr>
@@ -2375,6 +2758,7 @@
       <w:r>
         <w:rPr>
           <w:rFonts w:ascii="Times New Roman" w:hAnsi="Times New Roman" w:cs="Times New Roman"/>
+          <w:color w:val="000000" w:themeColor="text1"/>
           <w:spacing w:val="-2"/>
           <w:lang w:val="fi-FI"/>
         </w:rPr>
@@ -2386,6 +2770,7 @@
         <w:pStyle w:val="BodyText"/>
         <w:spacing w:before="3"/>
         <w:rPr>
+          <w:color w:val="000000" w:themeColor="text1"/>
           <w:sz w:val="23"/>
           <w:lang w:val="fi-FI"/>
         </w:rPr>
@@ -2407,8 +2792,14 @@
         <w:spacing w:before="146"/>
         <w:ind w:left="2227" w:hanging="2047"/>
         <w:contextualSpacing w:val="0"/>
-      </w:pPr>
-      <w:r>
+        <w:rPr>
+          <w:color w:val="000000" w:themeColor="text1"/>
+        </w:rPr>
+      </w:pPr>
+      <w:r>
+        <w:rPr>
+          <w:color w:val="000000" w:themeColor="text1"/>
+        </w:rPr>
         <w:t>LULUS Sidang Doktor, dengan usulan Nilai Akhir:</w:t>
       </w:r>
     </w:p>
@@ -2428,12 +2819,15 @@
         <w:spacing w:before="146"/>
         <w:ind w:left="2227" w:hanging="2047"/>
         <w:contextualSpacing w:val="0"/>
-      </w:pPr>
-      <w:r>
-        <w:t>dan Rekomendasi Yudisium:</w:t>
-      </w:r>
-      <w:r>
-        <w:t xml:space="preserve"> ……………………….</w:t>
+        <w:rPr>
+          <w:color w:val="000000" w:themeColor="text1"/>
+        </w:rPr>
+      </w:pPr>
+      <w:r>
+        <w:rPr>
+          <w:color w:val="000000" w:themeColor="text1"/>
+        </w:rPr>
+        <w:t>dan Rekomendasi Yudisium: ……………………….</w:t>
       </w:r>
     </w:p>
     <w:p>
@@ -2452,8 +2846,14 @@
         <w:spacing w:before="146"/>
         <w:ind w:left="2227" w:hanging="2047"/>
         <w:contextualSpacing w:val="0"/>
-      </w:pPr>
-      <w:r>
+        <w:rPr>
+          <w:color w:val="000000" w:themeColor="text1"/>
+        </w:rPr>
+      </w:pPr>
+      <w:r>
+        <w:rPr>
+          <w:color w:val="000000" w:themeColor="text1"/>
+        </w:rPr>
         <w:t>Tidak Lulus Sidang Doktor dan harus mengulang Sidang Doktor</w:t>
       </w:r>
     </w:p>
@@ -2464,6 +2864,7 @@
         <w:ind w:left="0"/>
         <w:rPr>
           <w:b/>
+          <w:color w:val="000000" w:themeColor="text1"/>
           <w:sz w:val="22"/>
         </w:rPr>
       </w:pPr>
@@ -2475,6 +2876,7 @@
         <w:ind w:left="0"/>
         <w:rPr>
           <w:b/>
+          <w:color w:val="000000" w:themeColor="text1"/>
           <w:sz w:val="22"/>
         </w:rPr>
       </w:pPr>
@@ -2485,12 +2887,14 @@
         <w:rPr>
           <w:rFonts w:ascii="Segoe UI" w:eastAsia="Segoe UI" w:hAnsi="Segoe UI" w:cs="Segoe UI"/>
           <w:b/>
+          <w:color w:val="000000" w:themeColor="text1"/>
           <w:sz w:val="22"/>
         </w:rPr>
       </w:pPr>
       <w:r>
         <w:rPr>
           <w:b/>
+          <w:color w:val="000000" w:themeColor="text1"/>
           <w:sz w:val="22"/>
         </w:rPr>
         <w:br w:type="page"/>
@@ -2503,6 +2907,7 @@
         <w:ind w:left="0"/>
         <w:rPr>
           <w:b/>
+          <w:color w:val="000000" w:themeColor="text1"/>
           <w:sz w:val="22"/>
           <w:lang w:val="fi-FI"/>
         </w:rPr>
@@ -2510,6 +2915,7 @@
       <w:r>
         <w:rPr>
           <w:b/>
+          <w:color w:val="000000" w:themeColor="text1"/>
           <w:sz w:val="22"/>
           <w:lang w:val="fi-FI"/>
         </w:rPr>
@@ -2524,6 +2930,7 @@
         <w:ind w:left="0"/>
         <w:rPr>
           <w:b/>
+          <w:color w:val="000000" w:themeColor="text1"/>
           <w:sz w:val="22"/>
           <w:lang w:val="fi-FI"/>
         </w:rPr>
@@ -2531,6 +2938,7 @@
       <w:r>
         <w:rPr>
           <w:b/>
+          <w:color w:val="000000" w:themeColor="text1"/>
           <w:sz w:val="22"/>
           <w:lang w:val="fi-FI"/>
         </w:rPr>
@@ -2539,6 +2947,7 @@
       <w:r>
         <w:rPr>
           <w:b/>
+          <w:color w:val="000000" w:themeColor="text1"/>
           <w:sz w:val="22"/>
           <w:lang w:val="fi-FI"/>
         </w:rPr>
@@ -2552,6 +2961,7 @@
         <w:ind w:left="0"/>
         <w:rPr>
           <w:b/>
+          <w:color w:val="000000" w:themeColor="text1"/>
           <w:sz w:val="22"/>
           <w:lang w:val="fi-FI"/>
         </w:rPr>
@@ -2559,6 +2969,7 @@
       <w:r>
         <w:rPr>
           <w:b/>
+          <w:color w:val="000000" w:themeColor="text1"/>
           <w:sz w:val="22"/>
           <w:lang w:val="fi-FI"/>
         </w:rPr>
@@ -2572,12 +2983,14 @@
         <w:ind w:left="0"/>
         <w:rPr>
           <w:b/>
+          <w:color w:val="000000" w:themeColor="text1"/>
           <w:sz w:val="22"/>
         </w:rPr>
       </w:pPr>
       <w:r>
         <w:rPr>
           <w:b/>
+          <w:color w:val="000000" w:themeColor="text1"/>
           <w:sz w:val="22"/>
         </w:rPr>
         <w:t>………………………………………………………………………………………………………………………….</w:t>
@@ -2590,6 +3003,7 @@
         <w:ind w:left="0"/>
         <w:rPr>
           <w:b/>
+          <w:color w:val="000000" w:themeColor="text1"/>
           <w:sz w:val="22"/>
         </w:rPr>
       </w:pPr>
@@ -2601,6 +3015,7 @@
         <w:ind w:left="0"/>
         <w:rPr>
           <w:b/>
+          <w:color w:val="000000" w:themeColor="text1"/>
           <w:sz w:val="22"/>
         </w:rPr>
       </w:pPr>
@@ -2612,6 +3027,7 @@
         <w:ind w:left="0"/>
         <w:rPr>
           <w:b/>
+          <w:color w:val="000000" w:themeColor="text1"/>
           <w:sz w:val="22"/>
         </w:rPr>
       </w:pPr>
@@ -2654,12 +3070,14 @@
               <w:ind w:left="50"/>
               <w:rPr>
                 <w:b/>
+                <w:color w:val="000000" w:themeColor="text1"/>
                 <w:sz w:val="24"/>
               </w:rPr>
             </w:pPr>
             <w:r>
               <w:rPr>
                 <w:b/>
+                <w:color w:val="000000" w:themeColor="text1"/>
                 <w:sz w:val="24"/>
               </w:rPr>
               <w:t>Tim</w:t>
@@ -2667,6 +3085,7 @@
             <w:r>
               <w:rPr>
                 <w:b/>
+                <w:color w:val="000000" w:themeColor="text1"/>
                 <w:spacing w:val="1"/>
                 <w:sz w:val="24"/>
               </w:rPr>
@@ -2675,6 +3094,7 @@
             <w:r>
               <w:rPr>
                 <w:b/>
+                <w:color w:val="000000" w:themeColor="text1"/>
                 <w:spacing w:val="-2"/>
                 <w:sz w:val="24"/>
               </w:rPr>
@@ -2691,6 +3111,7 @@
             <w:pPr>
               <w:pStyle w:val="TableParagraph"/>
               <w:rPr>
+                <w:color w:val="000000" w:themeColor="text1"/>
                 <w:sz w:val="24"/>
               </w:rPr>
             </w:pPr>
@@ -2709,12 +3130,14 @@
               <w:jc w:val="right"/>
               <w:rPr>
                 <w:b/>
+                <w:color w:val="000000" w:themeColor="text1"/>
                 <w:sz w:val="24"/>
               </w:rPr>
             </w:pPr>
             <w:r>
               <w:rPr>
                 <w:b/>
+                <w:color w:val="000000" w:themeColor="text1"/>
                 <w:sz w:val="24"/>
               </w:rPr>
               <w:t>Tanda</w:t>
@@ -2722,6 +3145,7 @@
             <w:r>
               <w:rPr>
                 <w:b/>
+                <w:color w:val="000000" w:themeColor="text1"/>
                 <w:spacing w:val="-4"/>
                 <w:sz w:val="24"/>
               </w:rPr>
@@ -2730,6 +3154,7 @@
             <w:r>
               <w:rPr>
                 <w:b/>
+                <w:color w:val="000000" w:themeColor="text1"/>
                 <w:spacing w:val="-2"/>
                 <w:sz w:val="24"/>
               </w:rPr>
@@ -2752,11 +3177,13 @@
               <w:spacing w:before="94"/>
               <w:ind w:left="50"/>
               <w:rPr>
-                <w:sz w:val="24"/>
-              </w:rPr>
-            </w:pPr>
-            <w:r>
-              <w:rPr>
+                <w:color w:val="000000" w:themeColor="text1"/>
+                <w:sz w:val="24"/>
+              </w:rPr>
+            </w:pPr>
+            <w:r>
+              <w:rPr>
+                <w:color w:val="000000" w:themeColor="text1"/>
                 <w:sz w:val="24"/>
               </w:rPr>
               <w:t>1</w:t>
@@ -2774,11 +3201,13 @@
               <w:spacing w:before="94"/>
               <w:ind w:left="155"/>
               <w:rPr>
-                <w:sz w:val="24"/>
-              </w:rPr>
-            </w:pPr>
-            <w:r>
-              <w:rPr>
+                <w:color w:val="000000" w:themeColor="text1"/>
+                <w:sz w:val="24"/>
+              </w:rPr>
+            </w:pPr>
+            <w:r>
+              <w:rPr>
+                <w:color w:val="000000" w:themeColor="text1"/>
                 <w:spacing w:val="-2"/>
                 <w:sz w:val="24"/>
                 <w:lang w:val="en-US"/>
@@ -2798,17 +3227,20 @@
               <w:spacing w:before="97"/>
               <w:ind w:left="133"/>
               <w:rPr>
-                <w:sz w:val="24"/>
-              </w:rPr>
-            </w:pPr>
-            <w:r>
-              <w:rPr>
+                <w:color w:val="000000" w:themeColor="text1"/>
+                <w:sz w:val="24"/>
+              </w:rPr>
+            </w:pPr>
+            <w:r>
+              <w:rPr>
+                <w:color w:val="000000" w:themeColor="text1"/>
                 <w:sz w:val="24"/>
               </w:rPr>
               <w:t>(Ketua</w:t>
             </w:r>
             <w:r>
               <w:rPr>
+                <w:color w:val="000000" w:themeColor="text1"/>
                 <w:spacing w:val="-6"/>
                 <w:sz w:val="24"/>
               </w:rPr>
@@ -2816,6 +3248,7 @@
             </w:r>
             <w:r>
               <w:rPr>
+                <w:color w:val="000000" w:themeColor="text1"/>
                 <w:spacing w:val="-5"/>
                 <w:sz w:val="24"/>
               </w:rPr>
@@ -2823,6 +3256,7 @@
             </w:r>
             <w:r>
               <w:rPr>
+                <w:color w:val="000000" w:themeColor="text1"/>
                 <w:spacing w:val="-2"/>
                 <w:sz w:val="24"/>
               </w:rPr>
@@ -2842,11 +3276,13 @@
               <w:ind w:left="90" w:right="48"/>
               <w:jc w:val="center"/>
               <w:rPr>
-                <w:sz w:val="24"/>
-              </w:rPr>
-            </w:pPr>
-            <w:r>
-              <w:rPr>
+                <w:color w:val="000000" w:themeColor="text1"/>
+                <w:sz w:val="24"/>
+              </w:rPr>
+            </w:pPr>
+            <w:r>
+              <w:rPr>
+                <w:color w:val="000000" w:themeColor="text1"/>
                 <w:spacing w:val="-2"/>
                 <w:sz w:val="24"/>
               </w:rPr>
@@ -2869,11 +3305,13 @@
               <w:spacing w:before="143"/>
               <w:ind w:left="50"/>
               <w:rPr>
-                <w:sz w:val="24"/>
-              </w:rPr>
-            </w:pPr>
-            <w:r>
-              <w:rPr>
+                <w:color w:val="000000" w:themeColor="text1"/>
+                <w:sz w:val="24"/>
+              </w:rPr>
+            </w:pPr>
+            <w:r>
+              <w:rPr>
+                <w:color w:val="000000" w:themeColor="text1"/>
                 <w:sz w:val="24"/>
               </w:rPr>
               <w:t>2</w:t>
@@ -2891,11 +3329,13 @@
               <w:spacing w:before="143"/>
               <w:ind w:left="155"/>
               <w:rPr>
-                <w:sz w:val="24"/>
-              </w:rPr>
-            </w:pPr>
-            <w:r>
-              <w:rPr>
+                <w:color w:val="000000" w:themeColor="text1"/>
+                <w:sz w:val="24"/>
+              </w:rPr>
+            </w:pPr>
+            <w:r>
+              <w:rPr>
+                <w:color w:val="000000" w:themeColor="text1"/>
                 <w:spacing w:val="-2"/>
                 <w:sz w:val="24"/>
                 <w:lang w:val="en-US"/>
@@ -2915,17 +3355,20 @@
               <w:spacing w:before="143"/>
               <w:ind w:left="133"/>
               <w:rPr>
-                <w:sz w:val="24"/>
-              </w:rPr>
-            </w:pPr>
-            <w:r>
-              <w:rPr>
+                <w:color w:val="000000" w:themeColor="text1"/>
+                <w:sz w:val="24"/>
+              </w:rPr>
+            </w:pPr>
+            <w:r>
+              <w:rPr>
+                <w:color w:val="000000" w:themeColor="text1"/>
                 <w:sz w:val="24"/>
               </w:rPr>
               <w:t>(Ko-Pembimbing</w:t>
             </w:r>
             <w:r>
               <w:rPr>
+                <w:color w:val="000000" w:themeColor="text1"/>
                 <w:spacing w:val="-8"/>
                 <w:sz w:val="24"/>
               </w:rPr>
@@ -2933,6 +3376,7 @@
             </w:r>
             <w:r>
               <w:rPr>
+                <w:color w:val="000000" w:themeColor="text1"/>
                 <w:spacing w:val="-5"/>
                 <w:sz w:val="24"/>
               </w:rPr>
@@ -2952,11 +3396,13 @@
               <w:ind w:right="48"/>
               <w:jc w:val="center"/>
               <w:rPr>
-                <w:sz w:val="24"/>
-              </w:rPr>
-            </w:pPr>
-            <w:r>
-              <w:rPr>
+                <w:color w:val="000000" w:themeColor="text1"/>
+                <w:sz w:val="24"/>
+              </w:rPr>
+            </w:pPr>
+            <w:r>
+              <w:rPr>
+                <w:color w:val="000000" w:themeColor="text1"/>
                 <w:spacing w:val="-2"/>
                 <w:sz w:val="24"/>
               </w:rPr>
@@ -2979,11 +3425,13 @@
               <w:spacing w:before="143"/>
               <w:ind w:left="50"/>
               <w:rPr>
-                <w:sz w:val="24"/>
-              </w:rPr>
-            </w:pPr>
-            <w:r>
-              <w:rPr>
+                <w:color w:val="000000" w:themeColor="text1"/>
+                <w:sz w:val="24"/>
+              </w:rPr>
+            </w:pPr>
+            <w:r>
+              <w:rPr>
+                <w:color w:val="000000" w:themeColor="text1"/>
                 <w:sz w:val="24"/>
               </w:rPr>
               <w:t>3</w:t>
@@ -3001,11 +3449,13 @@
               <w:spacing w:before="143"/>
               <w:ind w:left="155"/>
               <w:rPr>
-                <w:sz w:val="24"/>
-              </w:rPr>
-            </w:pPr>
-            <w:r>
-              <w:rPr>
+                <w:color w:val="000000" w:themeColor="text1"/>
+                <w:sz w:val="24"/>
+              </w:rPr>
+            </w:pPr>
+            <w:r>
+              <w:rPr>
+                <w:color w:val="000000" w:themeColor="text1"/>
                 <w:spacing w:val="-2"/>
                 <w:sz w:val="24"/>
                 <w:lang w:val="en-US"/>
@@ -3025,17 +3475,20 @@
               <w:spacing w:before="143"/>
               <w:ind w:left="133"/>
               <w:rPr>
-                <w:sz w:val="24"/>
-              </w:rPr>
-            </w:pPr>
-            <w:r>
-              <w:rPr>
+                <w:color w:val="000000" w:themeColor="text1"/>
+                <w:sz w:val="24"/>
+              </w:rPr>
+            </w:pPr>
+            <w:r>
+              <w:rPr>
+                <w:color w:val="000000" w:themeColor="text1"/>
                 <w:sz w:val="24"/>
               </w:rPr>
               <w:t>(Ko-Pembimbing</w:t>
             </w:r>
             <w:r>
               <w:rPr>
+                <w:color w:val="000000" w:themeColor="text1"/>
                 <w:spacing w:val="-8"/>
                 <w:sz w:val="24"/>
               </w:rPr>
@@ -3043,6 +3496,7 @@
             </w:r>
             <w:r>
               <w:rPr>
+                <w:color w:val="000000" w:themeColor="text1"/>
                 <w:spacing w:val="-5"/>
                 <w:sz w:val="24"/>
               </w:rPr>
@@ -3062,11 +3516,13 @@
               <w:ind w:right="48"/>
               <w:jc w:val="center"/>
               <w:rPr>
-                <w:sz w:val="24"/>
-              </w:rPr>
-            </w:pPr>
-            <w:r>
-              <w:rPr>
+                <w:color w:val="000000" w:themeColor="text1"/>
+                <w:sz w:val="24"/>
+              </w:rPr>
+            </w:pPr>
+            <w:r>
+              <w:rPr>
+                <w:color w:val="000000" w:themeColor="text1"/>
                 <w:spacing w:val="-2"/>
                 <w:sz w:val="24"/>
               </w:rPr>
@@ -3089,11 +3545,13 @@
               <w:spacing w:before="143"/>
               <w:ind w:left="50"/>
               <w:rPr>
-                <w:sz w:val="24"/>
-              </w:rPr>
-            </w:pPr>
-            <w:r>
-              <w:rPr>
+                <w:color w:val="000000" w:themeColor="text1"/>
+                <w:sz w:val="24"/>
+              </w:rPr>
+            </w:pPr>
+            <w:r>
+              <w:rPr>
+                <w:color w:val="000000" w:themeColor="text1"/>
                 <w:sz w:val="24"/>
               </w:rPr>
               <w:t>4</w:t>
@@ -3111,12 +3569,14 @@
               <w:spacing w:before="143"/>
               <w:ind w:left="155"/>
               <w:rPr>
+                <w:color w:val="000000" w:themeColor="text1"/>
                 <w:sz w:val="24"/>
                 <w:lang w:val="en-US"/>
               </w:rPr>
             </w:pPr>
             <w:r>
               <w:rPr>
+                <w:color w:val="000000" w:themeColor="text1"/>
                 <w:spacing w:val="-2"/>
                 <w:sz w:val="24"/>
                 <w:lang w:val="en-US"/>
@@ -3136,17 +3596,20 @@
               <w:spacing w:before="143"/>
               <w:ind w:left="133"/>
               <w:rPr>
-                <w:sz w:val="24"/>
-              </w:rPr>
-            </w:pPr>
-            <w:r>
-              <w:rPr>
+                <w:color w:val="000000" w:themeColor="text1"/>
+                <w:sz w:val="24"/>
+              </w:rPr>
+            </w:pPr>
+            <w:r>
+              <w:rPr>
+                <w:color w:val="000000" w:themeColor="text1"/>
                 <w:sz w:val="24"/>
               </w:rPr>
               <w:t>(Penguji</w:t>
             </w:r>
             <w:r>
               <w:rPr>
+                <w:color w:val="000000" w:themeColor="text1"/>
                 <w:spacing w:val="-5"/>
                 <w:sz w:val="24"/>
               </w:rPr>
@@ -3166,11 +3629,13 @@
               <w:ind w:right="48"/>
               <w:jc w:val="center"/>
               <w:rPr>
-                <w:sz w:val="24"/>
-              </w:rPr>
-            </w:pPr>
-            <w:r>
-              <w:rPr>
+                <w:color w:val="000000" w:themeColor="text1"/>
+                <w:sz w:val="24"/>
+              </w:rPr>
+            </w:pPr>
+            <w:r>
+              <w:rPr>
+                <w:color w:val="000000" w:themeColor="text1"/>
                 <w:spacing w:val="-2"/>
                 <w:sz w:val="24"/>
               </w:rPr>
@@ -3193,11 +3658,13 @@
               <w:spacing w:before="144"/>
               <w:ind w:left="50"/>
               <w:rPr>
-                <w:sz w:val="24"/>
-              </w:rPr>
-            </w:pPr>
-            <w:r>
-              <w:rPr>
+                <w:color w:val="000000" w:themeColor="text1"/>
+                <w:sz w:val="24"/>
+              </w:rPr>
+            </w:pPr>
+            <w:r>
+              <w:rPr>
+                <w:color w:val="000000" w:themeColor="text1"/>
                 <w:sz w:val="24"/>
               </w:rPr>
               <w:t>5</w:t>
@@ -3215,11 +3682,13 @@
               <w:spacing w:before="144"/>
               <w:ind w:left="155"/>
               <w:rPr>
-                <w:sz w:val="24"/>
-              </w:rPr>
-            </w:pPr>
-            <w:r>
-              <w:rPr>
+                <w:color w:val="000000" w:themeColor="text1"/>
+                <w:sz w:val="24"/>
+              </w:rPr>
+            </w:pPr>
+            <w:r>
+              <w:rPr>
+                <w:color w:val="000000" w:themeColor="text1"/>
                 <w:spacing w:val="-2"/>
                 <w:sz w:val="24"/>
                 <w:lang w:val="en-US"/>
@@ -3228,6 +3697,7 @@
             </w:r>
             <w:r>
               <w:rPr>
+                <w:color w:val="000000" w:themeColor="text1"/>
                 <w:spacing w:val="-2"/>
                 <w:sz w:val="24"/>
                 <w:lang w:val="en-US"/>
@@ -3247,17 +3717,20 @@
               <w:spacing w:before="144"/>
               <w:ind w:left="133"/>
               <w:rPr>
-                <w:sz w:val="24"/>
-              </w:rPr>
-            </w:pPr>
-            <w:r>
-              <w:rPr>
+                <w:color w:val="000000" w:themeColor="text1"/>
+                <w:sz w:val="24"/>
+              </w:rPr>
+            </w:pPr>
+            <w:r>
+              <w:rPr>
+                <w:color w:val="000000" w:themeColor="text1"/>
                 <w:sz w:val="24"/>
               </w:rPr>
               <w:t>(Penguji</w:t>
             </w:r>
             <w:r>
               <w:rPr>
+                <w:color w:val="000000" w:themeColor="text1"/>
                 <w:spacing w:val="-5"/>
                 <w:sz w:val="24"/>
               </w:rPr>
@@ -3277,11 +3750,13 @@
               <w:ind w:right="48"/>
               <w:jc w:val="center"/>
               <w:rPr>
-                <w:sz w:val="24"/>
-              </w:rPr>
-            </w:pPr>
-            <w:r>
-              <w:rPr>
+                <w:color w:val="000000" w:themeColor="text1"/>
+                <w:sz w:val="24"/>
+              </w:rPr>
+            </w:pPr>
+            <w:r>
+              <w:rPr>
+                <w:color w:val="000000" w:themeColor="text1"/>
                 <w:spacing w:val="-2"/>
                 <w:sz w:val="24"/>
               </w:rPr>
@@ -3304,11 +3779,13 @@
               <w:spacing w:before="143" w:line="256" w:lineRule="exact"/>
               <w:ind w:left="50"/>
               <w:rPr>
-                <w:sz w:val="24"/>
-              </w:rPr>
-            </w:pPr>
-            <w:r>
-              <w:rPr>
+                <w:color w:val="000000" w:themeColor="text1"/>
+                <w:sz w:val="24"/>
+              </w:rPr>
+            </w:pPr>
+            <w:r>
+              <w:rPr>
+                <w:color w:val="000000" w:themeColor="text1"/>
                 <w:sz w:val="24"/>
               </w:rPr>
               <w:t>6</w:t>
@@ -3326,11 +3803,13 @@
               <w:spacing w:before="143" w:line="256" w:lineRule="exact"/>
               <w:ind w:left="155"/>
               <w:rPr>
-                <w:sz w:val="24"/>
-              </w:rPr>
-            </w:pPr>
-            <w:r>
-              <w:rPr>
+                <w:color w:val="000000" w:themeColor="text1"/>
+                <w:sz w:val="24"/>
+              </w:rPr>
+            </w:pPr>
+            <w:r>
+              <w:rPr>
+                <w:color w:val="000000" w:themeColor="text1"/>
                 <w:spacing w:val="-2"/>
                 <w:sz w:val="24"/>
                 <w:lang w:val="en-US"/>
@@ -3350,17 +3829,20 @@
               <w:spacing w:before="143" w:line="256" w:lineRule="exact"/>
               <w:ind w:left="133"/>
               <w:rPr>
-                <w:sz w:val="24"/>
-              </w:rPr>
-            </w:pPr>
-            <w:r>
-              <w:rPr>
+                <w:color w:val="000000" w:themeColor="text1"/>
+                <w:sz w:val="24"/>
+              </w:rPr>
+            </w:pPr>
+            <w:r>
+              <w:rPr>
+                <w:color w:val="000000" w:themeColor="text1"/>
                 <w:sz w:val="24"/>
               </w:rPr>
               <w:t>(Penguji</w:t>
             </w:r>
             <w:r>
               <w:rPr>
+                <w:color w:val="000000" w:themeColor="text1"/>
                 <w:spacing w:val="-5"/>
                 <w:sz w:val="24"/>
               </w:rPr>
@@ -3380,11 +3862,13 @@
               <w:ind w:right="48"/>
               <w:jc w:val="center"/>
               <w:rPr>
-                <w:sz w:val="24"/>
-              </w:rPr>
-            </w:pPr>
-            <w:r>
-              <w:rPr>
+                <w:color w:val="000000" w:themeColor="text1"/>
+                <w:sz w:val="24"/>
+              </w:rPr>
+            </w:pPr>
+            <w:r>
+              <w:rPr>
+                <w:color w:val="000000" w:themeColor="text1"/>
                 <w:spacing w:val="-2"/>
                 <w:sz w:val="24"/>
               </w:rPr>
@@ -3399,6 +3883,7 @@
         <w:pStyle w:val="BodyText"/>
         <w:rPr>
           <w:b/>
+          <w:color w:val="000000" w:themeColor="text1"/>
           <w:sz w:val="20"/>
         </w:rPr>
       </w:pPr>
@@ -3408,6 +3893,7 @@
         <w:pStyle w:val="BodyText"/>
         <w:rPr>
           <w:b/>
+          <w:color w:val="000000" w:themeColor="text1"/>
           <w:sz w:val="20"/>
         </w:rPr>
       </w:pPr>
@@ -3418,6 +3904,7 @@
         <w:spacing w:before="8"/>
         <w:rPr>
           <w:b/>
+          <w:color w:val="000000" w:themeColor="text1"/>
           <w:sz w:val="19"/>
         </w:rPr>
       </w:pPr>
@@ -3432,17 +3919,20 @@
         <w:ind w:left="5040"/>
         <w:rPr>
           <w:rFonts w:ascii="Times New Roman" w:hAnsi="Times New Roman" w:cs="Times New Roman"/>
-        </w:rPr>
-      </w:pPr>
-      <w:r>
-        <w:rPr>
-          <w:rFonts w:ascii="Times New Roman" w:hAnsi="Times New Roman" w:cs="Times New Roman"/>
+          <w:color w:val="000000" w:themeColor="text1"/>
+        </w:rPr>
+      </w:pPr>
+      <w:r>
+        <w:rPr>
+          <w:rFonts w:ascii="Times New Roman" w:hAnsi="Times New Roman" w:cs="Times New Roman"/>
+          <w:color w:val="000000" w:themeColor="text1"/>
         </w:rPr>
         <w:t>Bandung,</w:t>
       </w:r>
       <w:r>
         <w:rPr>
           <w:rFonts w:ascii="Times New Roman" w:hAnsi="Times New Roman" w:cs="Times New Roman"/>
+          <w:color w:val="000000" w:themeColor="text1"/>
           <w:spacing w:val="-1"/>
         </w:rPr>
         <w:t xml:space="preserve"> </w:t>
@@ -3450,6 +3940,7 @@
       <w:r>
         <w:rPr>
           <w:rFonts w:ascii="Times New Roman" w:hAnsi="Times New Roman" w:cs="Times New Roman"/>
+          <w:color w:val="000000" w:themeColor="text1"/>
           <w:spacing w:val="-2"/>
         </w:rPr>
         <w:t>tgl create penilaian</w:t>
@@ -3464,17 +3955,20 @@
         <w:ind w:left="450"/>
         <w:rPr>
           <w:rFonts w:ascii="Times New Roman" w:hAnsi="Times New Roman" w:cs="Times New Roman"/>
-        </w:rPr>
-      </w:pPr>
-      <w:r>
-        <w:rPr>
-          <w:rFonts w:ascii="Times New Roman" w:hAnsi="Times New Roman" w:cs="Times New Roman"/>
+          <w:color w:val="000000" w:themeColor="text1"/>
+        </w:rPr>
+      </w:pPr>
+      <w:r>
+        <w:rPr>
+          <w:rFonts w:ascii="Times New Roman" w:hAnsi="Times New Roman" w:cs="Times New Roman"/>
+          <w:color w:val="000000" w:themeColor="text1"/>
         </w:rPr>
         <w:t>Ketua</w:t>
       </w:r>
       <w:r>
         <w:rPr>
           <w:rFonts w:ascii="Times New Roman" w:hAnsi="Times New Roman" w:cs="Times New Roman"/>
+          <w:color w:val="000000" w:themeColor="text1"/>
           <w:spacing w:val="-4"/>
         </w:rPr>
         <w:t xml:space="preserve"> </w:t>
@@ -3482,12 +3976,14 @@
       <w:r>
         <w:rPr>
           <w:rFonts w:ascii="Times New Roman" w:hAnsi="Times New Roman" w:cs="Times New Roman"/>
+          <w:color w:val="000000" w:themeColor="text1"/>
         </w:rPr>
         <w:t>Program</w:t>
       </w:r>
       <w:r>
         <w:rPr>
           <w:rFonts w:ascii="Times New Roman" w:hAnsi="Times New Roman" w:cs="Times New Roman"/>
+          <w:color w:val="000000" w:themeColor="text1"/>
           <w:spacing w:val="-3"/>
         </w:rPr>
         <w:t xml:space="preserve"> </w:t>
@@ -3495,6 +3991,7 @@
       <w:r>
         <w:rPr>
           <w:rFonts w:ascii="Times New Roman" w:hAnsi="Times New Roman" w:cs="Times New Roman"/>
+          <w:color w:val="000000" w:themeColor="text1"/>
           <w:spacing w:val="-2"/>
         </w:rPr>
         <w:t>Studi,</w:t>
@@ -3502,6 +3999,7 @@
       <w:r>
         <w:rPr>
           <w:rFonts w:ascii="Times New Roman" w:hAnsi="Times New Roman" w:cs="Times New Roman"/>
+          <w:color w:val="000000" w:themeColor="text1"/>
         </w:rPr>
         <w:tab/>
         <w:t>Ketua</w:t>
@@ -3509,6 +4007,7 @@
       <w:r>
         <w:rPr>
           <w:rFonts w:ascii="Times New Roman" w:hAnsi="Times New Roman" w:cs="Times New Roman"/>
+          <w:color w:val="000000" w:themeColor="text1"/>
           <w:spacing w:val="-4"/>
         </w:rPr>
         <w:t xml:space="preserve"> </w:t>
@@ -3516,12 +4015,14 @@
       <w:r>
         <w:rPr>
           <w:rFonts w:ascii="Times New Roman" w:hAnsi="Times New Roman" w:cs="Times New Roman"/>
+          <w:color w:val="000000" w:themeColor="text1"/>
         </w:rPr>
         <w:t>Sidang</w:t>
       </w:r>
       <w:r>
         <w:rPr>
           <w:rFonts w:ascii="Times New Roman" w:hAnsi="Times New Roman" w:cs="Times New Roman"/>
+          <w:color w:val="000000" w:themeColor="text1"/>
           <w:spacing w:val="-4"/>
         </w:rPr>
         <w:t xml:space="preserve"> </w:t>
@@ -3529,6 +4030,7 @@
       <w:r>
         <w:rPr>
           <w:rFonts w:ascii="Times New Roman" w:hAnsi="Times New Roman" w:cs="Times New Roman"/>
+          <w:color w:val="000000" w:themeColor="text1"/>
           <w:spacing w:val="-2"/>
         </w:rPr>
         <w:t>Doktor,</w:t>
@@ -3539,6 +4041,7 @@
         <w:pStyle w:val="BodyText"/>
         <w:rPr>
           <w:rFonts w:ascii="Times New Roman" w:hAnsi="Times New Roman" w:cs="Times New Roman"/>
+          <w:color w:val="000000" w:themeColor="text1"/>
           <w:sz w:val="26"/>
         </w:rPr>
       </w:pPr>
@@ -3548,6 +4051,7 @@
         <w:pStyle w:val="BodyText"/>
         <w:rPr>
           <w:rFonts w:ascii="Times New Roman" w:hAnsi="Times New Roman" w:cs="Times New Roman"/>
+          <w:color w:val="000000" w:themeColor="text1"/>
           <w:sz w:val="26"/>
         </w:rPr>
       </w:pPr>
@@ -3557,6 +4061,7 @@
         <w:pStyle w:val="BodyText"/>
         <w:rPr>
           <w:rFonts w:ascii="Times New Roman" w:hAnsi="Times New Roman" w:cs="Times New Roman"/>
+          <w:color w:val="000000" w:themeColor="text1"/>
           <w:sz w:val="26"/>
         </w:rPr>
       </w:pPr>
@@ -3566,6 +4071,7 @@
         <w:pStyle w:val="BodyText"/>
         <w:rPr>
           <w:rFonts w:ascii="Times New Roman" w:hAnsi="Times New Roman" w:cs="Times New Roman"/>
+          <w:color w:val="000000" w:themeColor="text1"/>
           <w:sz w:val="26"/>
         </w:rPr>
       </w:pPr>
@@ -3577,11 +4083,13 @@
         </w:tabs>
         <w:ind w:left="360"/>
         <w:rPr>
+          <w:color w:val="000000" w:themeColor="text1"/>
           <w:lang w:val="fi-FI"/>
         </w:rPr>
       </w:pPr>
       <w:r>
         <w:rPr>
+          <w:color w:val="000000" w:themeColor="text1"/>
           <w:spacing w:val="-2"/>
           <w:u w:val="single"/>
           <w:lang w:val="fi-FI"/>
@@ -3590,65 +4098,35 @@
       </w:r>
       <w:r>
         <w:rPr>
+          <w:color w:val="000000" w:themeColor="text1"/>
           <w:spacing w:val="-2"/>
           <w:u w:val="single"/>
           <w:lang w:val="fi-FI"/>
         </w:rPr>
-        <w:t>(</w:t>
-      </w:r>
-      <w:r>
-        <w:rPr>
-          <w:color w:val="FF0000"/>
+        <w:t>(nama kaprodi)</w:t>
+      </w:r>
+      <w:r>
+        <w:rPr>
+          <w:color w:val="000000" w:themeColor="text1"/>
+          <w:lang w:val="fi-FI"/>
+        </w:rPr>
+        <w:tab/>
+      </w:r>
+      <w:r>
+        <w:rPr>
+          <w:color w:val="000000" w:themeColor="text1"/>
+          <w:lang w:val="fi-FI"/>
+        </w:rPr>
+        <w:t>$</w:t>
+      </w:r>
+      <w:r>
+        <w:rPr>
+          <w:color w:val="000000" w:themeColor="text1"/>
           <w:spacing w:val="-2"/>
           <w:u w:val="single"/>
           <w:lang w:val="fi-FI"/>
         </w:rPr>
-        <w:t>nama kaprodi</w:t>
-      </w:r>
-      <w:r>
-        <w:rPr>
-          <w:spacing w:val="-2"/>
-          <w:u w:val="single"/>
-          <w:lang w:val="fi-FI"/>
-        </w:rPr>
-        <w:t>)</w:t>
-      </w:r>
-      <w:r>
-        <w:rPr>
-          <w:lang w:val="fi-FI"/>
-        </w:rPr>
-        <w:tab/>
-      </w:r>
-      <w:r>
-        <w:rPr>
-          <w:lang w:val="fi-FI"/>
-        </w:rPr>
-        <w:t>$</w:t>
-      </w:r>
-      <w:r>
-        <w:rPr>
-          <w:spacing w:val="-2"/>
-          <w:u w:val="single"/>
-          <w:lang w:val="fi-FI"/>
-        </w:rPr>
-        <w:t>(</w:t>
-      </w:r>
-      <w:r>
-        <w:rPr>
-          <w:color w:val="FF0000"/>
-          <w:spacing w:val="-2"/>
-          <w:u w:val="single"/>
-          <w:lang w:val="fi-FI"/>
-        </w:rPr>
-        <w:t>nama ketua sidang</w:t>
-      </w:r>
-      <w:r>
-        <w:rPr>
-          <w:spacing w:val="-2"/>
-          <w:u w:val="single"/>
-          <w:lang w:val="fi-FI"/>
-        </w:rPr>
-        <w:t>)</w:t>
+        <w:t>(nama ketua sidang)</w:t>
       </w:r>
     </w:p>
     <w:p>
@@ -3659,6 +4137,7 @@
         <w:ind w:left="360"/>
         <w:rPr>
           <w:b/>
+          <w:color w:val="000000" w:themeColor="text1"/>
           <w:sz w:val="22"/>
           <w:lang w:val="fi-FI"/>
         </w:rPr>
@@ -3666,6 +4145,7 @@
       <w:r>
         <w:rPr>
           <w:i/>
+          <w:color w:val="000000" w:themeColor="text1"/>
           <w:lang w:val="fi-FI"/>
         </w:rPr>
         <w:t>Tanda</w:t>
@@ -3673,6 +4153,7 @@
       <w:r>
         <w:rPr>
           <w:i/>
+          <w:color w:val="000000" w:themeColor="text1"/>
           <w:spacing w:val="-3"/>
           <w:lang w:val="fi-FI"/>
         </w:rPr>
@@ -3681,6 +4162,7 @@
       <w:r>
         <w:rPr>
           <w:i/>
+          <w:color w:val="000000" w:themeColor="text1"/>
           <w:lang w:val="fi-FI"/>
         </w:rPr>
         <w:t>Tangan</w:t>
@@ -3688,6 +4170,7 @@
       <w:r>
         <w:rPr>
           <w:i/>
+          <w:color w:val="000000" w:themeColor="text1"/>
           <w:spacing w:val="-2"/>
           <w:lang w:val="fi-FI"/>
         </w:rPr>
@@ -3696,6 +4179,7 @@
       <w:r>
         <w:rPr>
           <w:i/>
+          <w:color w:val="000000" w:themeColor="text1"/>
           <w:lang w:val="fi-FI"/>
         </w:rPr>
         <w:t>dan</w:t>
@@ -3703,6 +4187,7 @@
       <w:r>
         <w:rPr>
           <w:i/>
+          <w:color w:val="000000" w:themeColor="text1"/>
           <w:spacing w:val="-2"/>
           <w:lang w:val="fi-FI"/>
         </w:rPr>
@@ -3711,6 +4196,7 @@
       <w:r>
         <w:rPr>
           <w:i/>
+          <w:color w:val="000000" w:themeColor="text1"/>
           <w:lang w:val="fi-FI"/>
         </w:rPr>
         <w:t>Nama</w:t>
@@ -3718,6 +4204,7 @@
       <w:r>
         <w:rPr>
           <w:i/>
+          <w:color w:val="000000" w:themeColor="text1"/>
           <w:spacing w:val="-2"/>
           <w:lang w:val="fi-FI"/>
         </w:rPr>
@@ -3726,6 +4213,7 @@
       <w:r>
         <w:rPr>
           <w:i/>
+          <w:color w:val="000000" w:themeColor="text1"/>
           <w:lang w:val="fi-FI"/>
         </w:rPr>
         <w:tab/>
@@ -3734,6 +4222,7 @@
       <w:r>
         <w:rPr>
           <w:i/>
+          <w:color w:val="000000" w:themeColor="text1"/>
           <w:spacing w:val="-3"/>
           <w:lang w:val="fi-FI"/>
         </w:rPr>
@@ -3742,6 +4231,7 @@
       <w:r>
         <w:rPr>
           <w:i/>
+          <w:color w:val="000000" w:themeColor="text1"/>
           <w:lang w:val="fi-FI"/>
         </w:rPr>
         <w:t>Tangan</w:t>
@@ -3749,6 +4239,7 @@
       <w:r>
         <w:rPr>
           <w:i/>
+          <w:color w:val="000000" w:themeColor="text1"/>
           <w:spacing w:val="-2"/>
           <w:lang w:val="fi-FI"/>
         </w:rPr>
@@ -3757,6 +4248,7 @@
       <w:r>
         <w:rPr>
           <w:i/>
+          <w:color w:val="000000" w:themeColor="text1"/>
           <w:lang w:val="fi-FI"/>
         </w:rPr>
         <w:t>dan</w:t>
@@ -3764,6 +4256,7 @@
       <w:r>
         <w:rPr>
           <w:i/>
+          <w:color w:val="000000" w:themeColor="text1"/>
           <w:spacing w:val="-2"/>
           <w:lang w:val="fi-FI"/>
         </w:rPr>
@@ -3772,6 +4265,7 @@
       <w:r>
         <w:rPr>
           <w:i/>
+          <w:color w:val="000000" w:themeColor="text1"/>
           <w:lang w:val="fi-FI"/>
         </w:rPr>
         <w:t>Nama</w:t>
@@ -3779,6 +4273,7 @@
       <w:r>
         <w:rPr>
           <w:i/>
+          <w:color w:val="000000" w:themeColor="text1"/>
           <w:spacing w:val="-2"/>
           <w:lang w:val="fi-FI"/>
         </w:rPr>

</xml_diff>